<commit_message>
Add reusable report tooling (md -> docx / pdf) and the PDF render
reports/scripts/ gains two converters sharing one Markdown parser:
- md_to_docx.py: report markdown -> styled Word document (python-docx)
- md_to_pdf.py: same parser -> styled HTML -> PDF via headless Microsoft
  Edge (present on every Windows machine; no LibreOffice/Word needed)

The weekly report's .docx is regenerated from the markdown through the
new converter (verified: all sections, tables, and content probes; no
markdown syntax leaking into output), and the PDF render is added.
README documents usage for future reports.

Co-Authored-By: Claude Opus 4.8 <noreply@anthropic.com>
</commit_message>
<xml_diff>
--- a/reports/2026-07-13-weekly-report.docx
+++ b/reports/2026-07-13-weekly-report.docx
@@ -11,59 +11,95 @@
           <w:b/>
           <w:i w:val="0"/>
           <w:color w:val="2E6BA0"/>
-          <w:sz w:val="54"/>
+          <w:sz w:val="48"/>
         </w:rPr>
-        <w:t>KuantorFlow</w:t>
+        <w:t>KuantorFlow — Weekly Development Report</w:t>
+      </w:r>
+    </w:p>
+    <w:p>
+      <w:pPr>
+        <w:spacing w:after="120"/>
+      </w:pPr>
+      <w:r>
+        <w:rPr>
+          <w:b/>
+          <w:i w:val="0"/>
+          <w:color w:val="22303C"/>
+          <w:sz w:val="22"/>
+        </w:rPr>
+        <w:t>Period:</w:t>
       </w:r>
       <w:r>
         <w:rPr>
           <w:b w:val="0"/>
           <w:i w:val="0"/>
           <w:color w:val="22303C"/>
-          <w:sz w:val="38"/>
+          <w:sz w:val="22"/>
         </w:rPr>
-        <w:t xml:space="preserve">  Weekly Development Report</w:t>
+        <w:t xml:space="preserve"> 9–13 July 2026 · </w:t>
       </w:r>
-    </w:p>
-    <w:p>
-      <w:pPr>
-        <w:spacing w:after="40"/>
-      </w:pPr>
       <w:r>
         <w:rPr>
           <w:b/>
           <w:i w:val="0"/>
-          <w:color w:val="5B6B7A"/>
-          <w:sz w:val="20"/>
+          <w:color w:val="22303C"/>
+          <w:sz w:val="22"/>
         </w:rPr>
-        <w:t xml:space="preserve">Period: </w:t>
+        <w:t>Repositories:</w:t>
       </w:r>
       <w:r>
         <w:rPr>
           <w:b w:val="0"/>
           <w:i w:val="0"/>
-          <w:color w:val="5B6B7A"/>
-          <w:sz w:val="20"/>
+          <w:color w:val="22303C"/>
+          <w:sz w:val="22"/>
         </w:rPr>
-        <w:t>9–13 July 2026</w:t>
-      </w:r>
-      <w:r>
-        <w:rPr>
-          <w:b/>
-          <w:i w:val="0"/>
-          <w:color w:val="5B6B7A"/>
-          <w:sz w:val="20"/>
-        </w:rPr>
-        <w:t xml:space="preserve">      Repositories: </w:t>
+        <w:t xml:space="preserve"> </w:t>
       </w:r>
       <w:r>
         <w:rPr>
           <w:b w:val="0"/>
           <w:i w:val="0"/>
-          <w:color w:val="5B6B7A"/>
-          <w:sz w:val="20"/>
+          <w:color w:val="2E6BA0"/>
+          <w:sz w:val="22"/>
         </w:rPr>
-        <w:t>kuantorflow · ai_agent · kuantorflow_automation</w:t>
+        <w:t>kuantorflow</w:t>
+      </w:r>
+      <w:r>
+        <w:rPr>
+          <w:b w:val="0"/>
+          <w:i w:val="0"/>
+          <w:color w:val="22303C"/>
+          <w:sz w:val="22"/>
+        </w:rPr>
+        <w:t xml:space="preserve">, </w:t>
+      </w:r>
+      <w:r>
+        <w:rPr>
+          <w:b w:val="0"/>
+          <w:i w:val="0"/>
+          <w:color w:val="2E6BA0"/>
+          <w:sz w:val="22"/>
+        </w:rPr>
+        <w:t>ai_agent</w:t>
+      </w:r>
+      <w:r>
+        <w:rPr>
+          <w:b w:val="0"/>
+          <w:i w:val="0"/>
+          <w:color w:val="22303C"/>
+          <w:sz w:val="22"/>
+        </w:rPr>
+        <w:t xml:space="preserve">, </w:t>
+      </w:r>
+      <w:r>
+        <w:rPr>
+          <w:b w:val="0"/>
+          <w:i w:val="0"/>
+          <w:color w:val="2E6BA0"/>
+          <w:sz w:val="22"/>
+        </w:rPr>
+        <w:t>kuantorflow_automation</w:t>
       </w:r>
     </w:p>
     <w:p>
@@ -78,6 +114,12 @@
         <w:pStyle w:val="Heading1"/>
       </w:pPr>
       <w:r>
+        <w:rPr>
+          <w:b w:val="0"/>
+          <w:i w:val="0"/>
+          <w:color w:val="2E6BA0"/>
+          <w:sz w:val="30"/>
+        </w:rPr>
         <w:t>Executive Summary</w:t>
       </w:r>
     </w:p>
@@ -90,6 +132,7 @@
           <w:b w:val="0"/>
           <w:i w:val="0"/>
           <w:color w:val="22303C"/>
+          <w:sz w:val="22"/>
         </w:rPr>
         <w:t xml:space="preserve">In five days, KuantorFlow grew from an empty repository into a deployed, AI-powered language-learning platform: </w:t>
       </w:r>
@@ -98,6 +141,7 @@
           <w:b/>
           <w:i w:val="0"/>
           <w:color w:val="22303C"/>
+          <w:sz w:val="22"/>
         </w:rPr>
         <w:t>65 merged pull requests</w:t>
       </w:r>
@@ -106,6 +150,7 @@
           <w:b w:val="0"/>
           <w:i w:val="0"/>
           <w:color w:val="22303C"/>
+          <w:sz w:val="22"/>
         </w:rPr>
         <w:t xml:space="preserve"> across three repositories, live on PythonAnywhere.</w:t>
       </w:r>
@@ -119,6 +164,7 @@
           <w:b w:val="0"/>
           <w:i w:val="0"/>
           <w:color w:val="22303C"/>
+          <w:sz w:val="22"/>
         </w:rPr>
         <w:t xml:space="preserve">The product today: a Flask web application where Ukrainian- and Russian-speaking learners build bilingual flashcard collections from dictionary lookups and OneNote exports, drill them with quizzes — accompanied by </w:t>
       </w:r>
@@ -127,6 +173,7 @@
           <w:b/>
           <w:i w:val="0"/>
           <w:color w:val="22303C"/>
+          <w:sz w:val="22"/>
         </w:rPr>
         <w:t>Mykola</w:t>
       </w:r>
@@ -135,6 +182,7 @@
           <w:b w:val="0"/>
           <w:i w:val="0"/>
           <w:color w:val="22303C"/>
+          <w:sz w:val="22"/>
         </w:rPr>
         <w:t>, a persona-rich AI study companion (Claude-powered, RAG-grounded) who answers questions, adds flashcards to the database on request, remembers signed-in users between visits, and greets them with a recap of their previous conversations.</w:t>
       </w:r>
@@ -155,13 +203,14 @@
       <w:tr>
         <w:tc>
           <w:tcPr>
-            <w:tcW w:type="dxa" w:w="3024"/>
+            <w:tcW w:type="dxa" w:w="2394"/>
             <w:shd w:val="clear" w:fill="2E6BA0"/>
           </w:tcPr>
           <w:p>
             <w:r>
               <w:rPr>
                 <w:b/>
+                <w:i w:val="0"/>
                 <w:color w:val="FFFFFF"/>
                 <w:sz w:val="20"/>
               </w:rPr>
@@ -171,13 +220,14 @@
         </w:tc>
         <w:tc>
           <w:tcPr>
-            <w:tcW w:type="dxa" w:w="6192"/>
+            <w:tcW w:type="dxa" w:w="6310"/>
             <w:shd w:val="clear" w:fill="2E6BA0"/>
           </w:tcPr>
           <w:p>
             <w:r>
               <w:rPr>
                 <w:b/>
+                <w:i w:val="0"/>
                 <w:color w:val="FFFFFF"/>
                 <w:sz w:val="20"/>
               </w:rPr>
@@ -187,17 +237,18 @@
         </w:tc>
         <w:tc>
           <w:tcPr>
-            <w:tcW w:type="dxa" w:w="864"/>
+            <w:tcW w:type="dxa" w:w="1088"/>
             <w:shd w:val="clear" w:fill="2E6BA0"/>
           </w:tcPr>
           <w:p>
             <w:r>
               <w:rPr>
                 <w:b/>
+                <w:i w:val="0"/>
                 <w:color w:val="FFFFFF"/>
                 <w:sz w:val="20"/>
               </w:rPr>
-              <w:t>PRs</w:t>
+              <w:t>Merged PRs</w:t>
             </w:r>
           </w:p>
         </w:tc>
@@ -205,11 +256,13 @@
       <w:tr>
         <w:tc>
           <w:tcPr>
-            <w:tcW w:type="dxa" w:w="3024"/>
+            <w:tcW w:type="dxa" w:w="2394"/>
           </w:tcPr>
           <w:p>
             <w:r>
               <w:rPr>
+                <w:b/>
+                <w:i w:val="0"/>
                 <w:color w:val="22303C"/>
                 <w:sz w:val="20"/>
               </w:rPr>
@@ -219,11 +272,13 @@
         </w:tc>
         <w:tc>
           <w:tcPr>
-            <w:tcW w:type="dxa" w:w="6192"/>
+            <w:tcW w:type="dxa" w:w="6310"/>
           </w:tcPr>
           <w:p>
             <w:r>
               <w:rPr>
+                <w:b w:val="0"/>
+                <w:i w:val="0"/>
                 <w:color w:val="22303C"/>
                 <w:sz w:val="20"/>
               </w:rPr>
@@ -233,11 +288,13 @@
         </w:tc>
         <w:tc>
           <w:tcPr>
-            <w:tcW w:type="dxa" w:w="864"/>
+            <w:tcW w:type="dxa" w:w="1088"/>
           </w:tcPr>
           <w:p>
             <w:r>
               <w:rPr>
+                <w:b w:val="0"/>
+                <w:i w:val="0"/>
                 <w:color w:val="22303C"/>
                 <w:sz w:val="20"/>
               </w:rPr>
@@ -249,11 +306,13 @@
       <w:tr>
         <w:tc>
           <w:tcPr>
-            <w:tcW w:type="dxa" w:w="3024"/>
+            <w:tcW w:type="dxa" w:w="2394"/>
           </w:tcPr>
           <w:p>
             <w:r>
               <w:rPr>
+                <w:b/>
+                <w:i w:val="0"/>
                 <w:color w:val="22303C"/>
                 <w:sz w:val="20"/>
               </w:rPr>
@@ -263,11 +322,13 @@
         </w:tc>
         <w:tc>
           <w:tcPr>
-            <w:tcW w:type="dxa" w:w="6192"/>
+            <w:tcW w:type="dxa" w:w="6310"/>
           </w:tcPr>
           <w:p>
             <w:r>
               <w:rPr>
+                <w:b w:val="0"/>
+                <w:i w:val="0"/>
                 <w:color w:val="22303C"/>
                 <w:sz w:val="20"/>
               </w:rPr>
@@ -277,11 +338,13 @@
         </w:tc>
         <w:tc>
           <w:tcPr>
-            <w:tcW w:type="dxa" w:w="864"/>
+            <w:tcW w:type="dxa" w:w="1088"/>
           </w:tcPr>
           <w:p>
             <w:r>
               <w:rPr>
+                <w:b w:val="0"/>
+                <w:i w:val="0"/>
                 <w:color w:val="22303C"/>
                 <w:sz w:val="20"/>
               </w:rPr>
@@ -293,11 +356,13 @@
       <w:tr>
         <w:tc>
           <w:tcPr>
-            <w:tcW w:type="dxa" w:w="3024"/>
+            <w:tcW w:type="dxa" w:w="2394"/>
           </w:tcPr>
           <w:p>
             <w:r>
               <w:rPr>
+                <w:b/>
+                <w:i w:val="0"/>
                 <w:color w:val="22303C"/>
                 <w:sz w:val="20"/>
               </w:rPr>
@@ -307,11 +372,13 @@
         </w:tc>
         <w:tc>
           <w:tcPr>
-            <w:tcW w:type="dxa" w:w="6192"/>
+            <w:tcW w:type="dxa" w:w="6310"/>
           </w:tcPr>
           <w:p>
             <w:r>
               <w:rPr>
+                <w:b w:val="0"/>
+                <w:i w:val="0"/>
                 <w:color w:val="22303C"/>
                 <w:sz w:val="20"/>
               </w:rPr>
@@ -321,11 +388,13 @@
         </w:tc>
         <w:tc>
           <w:tcPr>
-            <w:tcW w:type="dxa" w:w="864"/>
+            <w:tcW w:type="dxa" w:w="1088"/>
           </w:tcPr>
           <w:p>
             <w:r>
               <w:rPr>
+                <w:b w:val="0"/>
+                <w:i w:val="0"/>
                 <w:color w:val="22303C"/>
                 <w:sz w:val="20"/>
               </w:rPr>
@@ -337,11 +406,13 @@
       <w:tr>
         <w:tc>
           <w:tcPr>
-            <w:tcW w:type="dxa" w:w="3024"/>
+            <w:tcW w:type="dxa" w:w="2394"/>
           </w:tcPr>
           <w:p>
             <w:r>
               <w:rPr>
+                <w:b/>
+                <w:i w:val="0"/>
                 <w:color w:val="22303C"/>
                 <w:sz w:val="20"/>
               </w:rPr>
@@ -351,24 +422,19 @@
         </w:tc>
         <w:tc>
           <w:tcPr>
-            <w:tcW w:type="dxa" w:w="6192"/>
+            <w:tcW w:type="dxa" w:w="6310"/>
+          </w:tcPr>
+          <w:p/>
+        </w:tc>
+        <w:tc>
+          <w:tcPr>
+            <w:tcW w:type="dxa" w:w="1088"/>
           </w:tcPr>
           <w:p>
             <w:r>
               <w:rPr>
-                <w:color w:val="22303C"/>
-                <w:sz w:val="20"/>
-              </w:rPr>
-            </w:r>
-          </w:p>
-        </w:tc>
-        <w:tc>
-          <w:tcPr>
-            <w:tcW w:type="dxa" w:w="864"/>
-          </w:tcPr>
-          <w:p>
-            <w:r>
-              <w:rPr>
+                <w:b/>
+                <w:i w:val="0"/>
                 <w:color w:val="22303C"/>
                 <w:sz w:val="20"/>
               </w:rPr>
@@ -385,9 +451,22 @@
     </w:p>
     <w:p>
       <w:pPr>
+        <w:pBdr>
+          <w:bottom w:val="single" w:sz="8" w:color="D9B13C"/>
+        </w:pBdr>
+      </w:pPr>
+    </w:p>
+    <w:p>
+      <w:pPr>
         <w:pStyle w:val="Heading1"/>
       </w:pPr>
       <w:r>
+        <w:rPr>
+          <w:b w:val="0"/>
+          <w:i w:val="0"/>
+          <w:color w:val="2E6BA0"/>
+          <w:sz w:val="30"/>
+        </w:rPr>
         <w:t>Completed Work by Theme</w:t>
       </w:r>
     </w:p>
@@ -396,6 +475,12 @@
         <w:pStyle w:val="Heading2"/>
       </w:pPr>
       <w:r>
+        <w:rPr>
+          <w:b w:val="0"/>
+          <w:i w:val="0"/>
+          <w:color w:val="22303C"/>
+          <w:sz w:val="25"/>
+        </w:rPr>
         <w:t>1. Product foundation (kuantorflow #1–#12)</w:t>
       </w:r>
     </w:p>
@@ -408,6 +493,7 @@
           <w:b w:val="0"/>
           <w:i w:val="0"/>
           <w:color w:val="22303C"/>
+          <w:sz w:val="22"/>
         </w:rPr>
         <w:t>The core learning product was built in the first two days:</w:t>
       </w:r>
@@ -422,16 +508,37 @@
           <w:b/>
           <w:i w:val="0"/>
           <w:color w:val="22303C"/>
+          <w:sz w:val="22"/>
         </w:rPr>
-        <w:t xml:space="preserve">Flashcards end-to-end (#1): </w:t>
+        <w:t>Flashcards end-to-end</w:t>
       </w:r>
       <w:r>
         <w:rPr>
           <w:b w:val="0"/>
           <w:i w:val="0"/>
           <w:color w:val="22303C"/>
+          <w:sz w:val="22"/>
         </w:rPr>
-        <w:t>parsing word lookups and OneNote .mht exports into cards, saving to MySQL, browsing by topic, and a bilingual (UA/RU) quiz mode.</w:t>
+        <w:t xml:space="preserve"> (#1): parsing word lookups and OneNote </w:t>
+      </w:r>
+      <w:r>
+        <w:rPr>
+          <w:rFonts w:ascii="Consolas" w:hAnsi="Consolas"/>
+          <w:b w:val="0"/>
+          <w:i w:val="0"/>
+          <w:color w:val="22303C"/>
+          <w:sz w:val="22"/>
+        </w:rPr>
+        <w:t>.mht</w:t>
+      </w:r>
+      <w:r>
+        <w:rPr>
+          <w:b w:val="0"/>
+          <w:i w:val="0"/>
+          <w:color w:val="22303C"/>
+          <w:sz w:val="22"/>
+        </w:rPr>
+        <w:t xml:space="preserve"> exports into cards, saving to MySQL, browsing by topic, and a bilingual (UA/RU) quiz mode.</w:t>
       </w:r>
     </w:p>
     <w:p>
@@ -444,16 +551,18 @@
           <w:b/>
           <w:i w:val="0"/>
           <w:color w:val="22303C"/>
+          <w:sz w:val="22"/>
         </w:rPr>
-        <w:t xml:space="preserve">Smarter lookups (#2, #7): </w:t>
+        <w:t>Smarter lookups</w:t>
       </w:r>
       <w:r>
         <w:rPr>
           <w:b w:val="0"/>
           <w:i w:val="0"/>
           <w:color w:val="22303C"/>
+          <w:sz w:val="22"/>
         </w:rPr>
-        <w:t>one card per part of speech, English definitions, translation gap-filling between Ukrainian and Russian; the lookup backend moved from Reverso scraping to Google Translate dictionary data for reliability.</w:t>
+        <w:t xml:space="preserve"> (#2, #7): one card per part of speech, English definitions, translation gap-filling between Ukrainian and Russian; the lookup backend was switched from Reverso scraping to Google Translate's dictionary data for reliability.</w:t>
       </w:r>
     </w:p>
     <w:p>
@@ -466,16 +575,18 @@
           <w:b/>
           <w:i w:val="0"/>
           <w:color w:val="22303C"/>
+          <w:sz w:val="22"/>
         </w:rPr>
-        <w:t xml:space="preserve">Review before save (#12): </w:t>
+        <w:t>Review before save</w:t>
       </w:r>
       <w:r>
         <w:rPr>
           <w:b w:val="0"/>
           <w:i w:val="0"/>
           <w:color w:val="22303C"/>
+          <w:sz w:val="22"/>
         </w:rPr>
-        <w:t>looked-up cards go through an edit/delete review popup instead of saving blind — a pattern later reused for file imports.</w:t>
+        <w:t xml:space="preserve"> (#12): looked-up cards go through an edit/delete review popup instead of saving blind — a pattern later reused for file imports.</w:t>
       </w:r>
     </w:p>
     <w:p>
@@ -488,16 +599,18 @@
           <w:b/>
           <w:i w:val="0"/>
           <w:color w:val="22303C"/>
+          <w:sz w:val="22"/>
         </w:rPr>
-        <w:t xml:space="preserve">Polish and access control: </w:t>
+        <w:t>Polish and access control</w:t>
       </w:r>
       <w:r>
         <w:rPr>
           <w:b w:val="0"/>
           <w:i w:val="0"/>
           <w:color w:val="22303C"/>
+          <w:sz w:val="22"/>
         </w:rPr>
-        <w:t>blue/yellow theme with topic chips (#3), card deletion with confirmation (#9), Open Graph link previews (#8), favicon (#10), environment-based DB credentials (#5), and a keyword access gate for the whole site (#11).</w:t>
+        <w:t>: blue/yellow theme with topic chips (#3), card deletion with confirmation (#9), Open Graph link previews (#8), favicon (#10), environment-based DB credentials (#5), and a keyword access gate for the whole site (#11).</w:t>
       </w:r>
     </w:p>
     <w:p>
@@ -505,6 +618,12 @@
         <w:pStyle w:val="Heading2"/>
       </w:pPr>
       <w:r>
+        <w:rPr>
+          <w:b w:val="0"/>
+          <w:i w:val="0"/>
+          <w:color w:val="22303C"/>
+          <w:sz w:val="25"/>
+        </w:rPr>
         <w:t>2. Birth of the agent (ai_agent #1–#9)</w:t>
       </w:r>
     </w:p>
@@ -518,16 +637,18 @@
           <w:b/>
           <w:i w:val="0"/>
           <w:color w:val="22303C"/>
+          <w:sz w:val="22"/>
         </w:rPr>
-        <w:t xml:space="preserve">RAG core (#1): </w:t>
+        <w:t>RAG core</w:t>
       </w:r>
       <w:r>
         <w:rPr>
           <w:b w:val="0"/>
           <w:i w:val="0"/>
           <w:color w:val="22303C"/>
+          <w:sz w:val="22"/>
         </w:rPr>
-        <w:t>a retrieval-augmented agent answering English-learning questions from a markdown knowledge base (TF-IDF retrieval over heading-split chunks) with source citations.</w:t>
+        <w:t xml:space="preserve"> (#1): a retrieval-augmented agent answering English-learning questions from a markdown knowledge base (TF-IDF retrieval over heading-split chunks) with source citations.</w:t>
       </w:r>
     </w:p>
     <w:p>
@@ -540,16 +661,18 @@
           <w:b/>
           <w:i w:val="0"/>
           <w:color w:val="22303C"/>
+          <w:sz w:val="22"/>
         </w:rPr>
-        <w:t xml:space="preserve">Standalone web app (#2): </w:t>
+        <w:t>Standalone web app</w:t>
       </w:r>
       <w:r>
         <w:rPr>
           <w:b w:val="0"/>
           <w:i w:val="0"/>
           <w:color w:val="22303C"/>
+          <w:sz w:val="22"/>
         </w:rPr>
-        <w:t>Flask chat UI with gallery/About pages.</w:t>
+        <w:t xml:space="preserve"> (#2): Flask chat UI with gallery/About pages.</w:t>
       </w:r>
     </w:p>
     <w:p>
@@ -562,16 +685,55 @@
           <w:b/>
           <w:i w:val="0"/>
           <w:color w:val="22303C"/>
+          <w:sz w:val="22"/>
         </w:rPr>
-        <w:t xml:space="preserve">The keystone architecture decision (#9): </w:t>
+        <w:t>The keystone architecture decision</w:t>
       </w:r>
       <w:r>
         <w:rPr>
           <w:b w:val="0"/>
           <w:i w:val="0"/>
           <w:color w:val="22303C"/>
+          <w:sz w:val="22"/>
         </w:rPr>
-        <w:t>the chatbot was extracted into an importable agent class so the main site could import the agent rather than duplicate it — the single-source, two-repo composition every later feature builds on.</w:t>
+        <w:t xml:space="preserve"> (#9): the chatbot was extracted into an importable </w:t>
+      </w:r>
+      <w:r>
+        <w:rPr>
+          <w:rFonts w:ascii="Consolas" w:hAnsi="Consolas"/>
+          <w:b w:val="0"/>
+          <w:i w:val="0"/>
+          <w:color w:val="22303C"/>
+          <w:sz w:val="22"/>
+        </w:rPr>
+        <w:t>TynnaAgent</w:t>
+      </w:r>
+      <w:r>
+        <w:rPr>
+          <w:b w:val="0"/>
+          <w:i w:val="0"/>
+          <w:color w:val="22303C"/>
+          <w:sz w:val="22"/>
+        </w:rPr>
+        <w:t xml:space="preserve"> class so the main site could </w:t>
+      </w:r>
+      <w:r>
+        <w:rPr>
+          <w:b w:val="0"/>
+          <w:i/>
+          <w:color w:val="22303C"/>
+          <w:sz w:val="22"/>
+        </w:rPr>
+        <w:t>import</w:t>
+      </w:r>
+      <w:r>
+        <w:rPr>
+          <w:b w:val="0"/>
+          <w:i w:val="0"/>
+          <w:color w:val="22303C"/>
+          <w:sz w:val="22"/>
+        </w:rPr>
+        <w:t xml:space="preserve"> the agent rather than duplicate it — the single-source, two-repo composition that every later feature builds on.</w:t>
       </w:r>
     </w:p>
     <w:p>
@@ -581,19 +743,12 @@
       </w:pPr>
       <w:r>
         <w:rPr>
-          <w:b/>
-          <w:i w:val="0"/>
-          <w:color w:val="22303C"/>
-        </w:rPr>
-        <w:t xml:space="preserve">Early capabilities: </w:t>
-      </w:r>
-      <w:r>
-        <w:rPr>
           <w:b w:val="0"/>
           <w:i w:val="0"/>
           <w:color w:val="22303C"/>
+          <w:sz w:val="22"/>
         </w:rPr>
-        <w:t>flashcards-database access and study lists (#15, #16), friendly API-error messaging (#5), chat-output markdown fixes (#6, #18), a music player for the standalone app (#13, #14).</w:t>
+        <w:t>Early capabilities: flashcards-database access and study-list generation (#15, #16), friendly API-error messaging (#5), chat-output markdown fixes (#6, #18), a music player for the standalone app (#13, #14).</w:t>
       </w:r>
     </w:p>
     <w:p>
@@ -601,6 +756,12 @@
         <w:pStyle w:val="Heading2"/>
       </w:pPr>
       <w:r>
+        <w:rPr>
+          <w:b w:val="0"/>
+          <w:i w:val="0"/>
+          <w:color w:val="22303C"/>
+          <w:sz w:val="25"/>
+        </w:rPr>
         <w:t>3. Integration era (kuantorflow #26–#39)</w:t>
       </w:r>
     </w:p>
@@ -613,6 +774,7 @@
           <w:b w:val="0"/>
           <w:i w:val="0"/>
           <w:color w:val="22303C"/>
+          <w:sz w:val="22"/>
         </w:rPr>
         <w:t>The agent moved into the main site as a floating chat widget:</w:t>
       </w:r>
@@ -627,16 +789,36 @@
           <w:b/>
           <w:i w:val="0"/>
           <w:color w:val="22303C"/>
+          <w:sz w:val="22"/>
         </w:rPr>
-        <w:t xml:space="preserve">Widget integration (#26) </w:t>
+        <w:t>Widget integration</w:t>
       </w:r>
       <w:r>
         <w:rPr>
           <w:b w:val="0"/>
           <w:i w:val="0"/>
           <w:color w:val="22303C"/>
+          <w:sz w:val="22"/>
         </w:rPr>
-        <w:t>with minimize/maximize, avatar animation, and an About page — served by a cross-repo Jinja loader that renders the shared About partial and media straight from the ai_agent checkout (no copies).</w:t>
+        <w:t xml:space="preserve"> (#26) with minimize/maximize, avatar animation, and an About page — served by a </w:t>
+      </w:r>
+      <w:r>
+        <w:rPr>
+          <w:b/>
+          <w:i w:val="0"/>
+          <w:color w:val="22303C"/>
+          <w:sz w:val="22"/>
+        </w:rPr>
+        <w:t>cross-repo Jinja loader</w:t>
+      </w:r>
+      <w:r>
+        <w:rPr>
+          <w:b w:val="0"/>
+          <w:i w:val="0"/>
+          <w:color w:val="22303C"/>
+          <w:sz w:val="22"/>
+        </w:rPr>
+        <w:t xml:space="preserve"> that renders the shared About partial and media straight from the ai_agent checkout (no copies).</w:t>
       </w:r>
     </w:p>
     <w:p>
@@ -649,16 +831,18 @@
           <w:b/>
           <w:i w:val="0"/>
           <w:color w:val="22303C"/>
+          <w:sz w:val="22"/>
         </w:rPr>
-        <w:t xml:space="preserve">Two-step welcome popup </w:t>
+        <w:t>Two-step welcome popup</w:t>
       </w:r>
       <w:r>
         <w:rPr>
           <w:b w:val="0"/>
           <w:i w:val="0"/>
           <w:color w:val="22303C"/>
+          <w:sz w:val="22"/>
         </w:rPr>
-        <w:t>introducing the companion (#33, #37), wave-animation launcher (#39), full-page chat opened from the widget (#35), and chat logging (#32; ai_agent #24).</w:t>
+        <w:t xml:space="preserve"> introducing the companion (#33, #37), wave-animation launcher (#39), full-page chat opened from the widget (#35), and chat logging (#32; ai_agent #24).</w:t>
       </w:r>
     </w:p>
     <w:p>
@@ -666,6 +850,12 @@
         <w:pStyle w:val="Heading2"/>
       </w:pPr>
       <w:r>
+        <w:rPr>
+          <w:b w:val="0"/>
+          <w:i w:val="0"/>
+          <w:color w:val="22303C"/>
+          <w:sz w:val="25"/>
+        </w:rPr>
         <w:t>4. Platform hardening</w:t>
       </w:r>
     </w:p>
@@ -679,16 +869,75 @@
           <w:b/>
           <w:i w:val="0"/>
           <w:color w:val="22303C"/>
+          <w:sz w:val="22"/>
         </w:rPr>
-        <w:t xml:space="preserve">The dependency saga (kuantorflow #28; ai_agent #21, #22): </w:t>
+        <w:t>The dependency saga</w:t>
       </w:r>
       <w:r>
         <w:rPr>
           <w:b w:val="0"/>
           <w:i w:val="0"/>
           <w:color w:val="22303C"/>
+          <w:sz w:val="22"/>
         </w:rPr>
-        <w:t>an lxml build failure on Python 3.14 (no cp314 wheel for the pinned version) was diagnosed and fixed; all dependencies pinned, a fully-resolved requirements.lock introduced, both repos aligned to production versions, and production migrated to Python 3.13 on PythonAnywhere.</w:t>
+        <w:t xml:space="preserve"> (kuantorflow #28; ai_agent #21, #22): a </w:t>
+      </w:r>
+      <w:r>
+        <w:rPr>
+          <w:rFonts w:ascii="Consolas" w:hAnsi="Consolas"/>
+          <w:b w:val="0"/>
+          <w:i w:val="0"/>
+          <w:color w:val="22303C"/>
+          <w:sz w:val="22"/>
+        </w:rPr>
+        <w:t>lxml</w:t>
+      </w:r>
+      <w:r>
+        <w:rPr>
+          <w:b w:val="0"/>
+          <w:i w:val="0"/>
+          <w:color w:val="22303C"/>
+          <w:sz w:val="22"/>
+        </w:rPr>
+        <w:t xml:space="preserve"> build failure on Python 3.14 (no </w:t>
+      </w:r>
+      <w:r>
+        <w:rPr>
+          <w:rFonts w:ascii="Consolas" w:hAnsi="Consolas"/>
+          <w:b w:val="0"/>
+          <w:i w:val="0"/>
+          <w:color w:val="22303C"/>
+          <w:sz w:val="22"/>
+        </w:rPr>
+        <w:t>cp314</w:t>
+      </w:r>
+      <w:r>
+        <w:rPr>
+          <w:b w:val="0"/>
+          <w:i w:val="0"/>
+          <w:color w:val="22303C"/>
+          <w:sz w:val="22"/>
+        </w:rPr>
+        <w:t xml:space="preserve"> wheel for the pinned version) was diagnosed and fixed; all dependencies were pinned, a fully-resolved </w:t>
+      </w:r>
+      <w:r>
+        <w:rPr>
+          <w:rFonts w:ascii="Consolas" w:hAnsi="Consolas"/>
+          <w:b w:val="0"/>
+          <w:i w:val="0"/>
+          <w:color w:val="22303C"/>
+          <w:sz w:val="22"/>
+        </w:rPr>
+        <w:t>requirements.lock</w:t>
+      </w:r>
+      <w:r>
+        <w:rPr>
+          <w:b w:val="0"/>
+          <w:i w:val="0"/>
+          <w:color w:val="22303C"/>
+          <w:sz w:val="22"/>
+        </w:rPr>
+        <w:t xml:space="preserve"> introduced for reproducible deploys, and both repos aligned to the same production versions. Production was migrated to Python 3.13 on PythonAnywhere.</w:t>
       </w:r>
     </w:p>
     <w:p>
@@ -701,16 +950,37 @@
           <w:b/>
           <w:i w:val="0"/>
           <w:color w:val="22303C"/>
+          <w:sz w:val="22"/>
         </w:rPr>
-        <w:t xml:space="preserve">Request-size caps (kuantorflow #29; ai_agent #22): </w:t>
+        <w:t>Request-size caps</w:t>
       </w:r>
       <w:r>
         <w:rPr>
           <w:b w:val="0"/>
           <w:i w:val="0"/>
           <w:color w:val="22303C"/>
+          <w:sz w:val="22"/>
         </w:rPr>
-        <w:t>1 MB guards on chat endpoints against memory abuse and runaway API costs — scoped per-endpoint so legitimate large .mht uploads still work.</w:t>
+        <w:t xml:space="preserve"> (kuantorflow #29; ai_agent #22): 1 MB guards on chat endpoints against memory abuse and runaway API costs — scoped per-endpoint so legitimate large </w:t>
+      </w:r>
+      <w:r>
+        <w:rPr>
+          <w:rFonts w:ascii="Consolas" w:hAnsi="Consolas"/>
+          <w:b w:val="0"/>
+          <w:i w:val="0"/>
+          <w:color w:val="22303C"/>
+          <w:sz w:val="22"/>
+        </w:rPr>
+        <w:t>.mht</w:t>
+      </w:r>
+      <w:r>
+        <w:rPr>
+          <w:b w:val="0"/>
+          <w:i w:val="0"/>
+          <w:color w:val="22303C"/>
+          <w:sz w:val="22"/>
+        </w:rPr>
+        <w:t xml:space="preserve"> uploads still work.</w:t>
       </w:r>
     </w:p>
     <w:p>
@@ -723,16 +993,18 @@
           <w:b/>
           <w:i w:val="0"/>
           <w:color w:val="22303C"/>
+          <w:sz w:val="22"/>
         </w:rPr>
-        <w:t xml:space="preserve">Log privacy (kuantorflow #57; ai_agent #42): </w:t>
+        <w:t>Log privacy</w:t>
       </w:r>
       <w:r>
         <w:rPr>
           <w:b w:val="0"/>
           <w:i w:val="0"/>
           <w:color w:val="22303C"/>
+          <w:sz w:val="22"/>
         </w:rPr>
-        <w:t>gitignore hardening so per-user chat logs can never be accidentally committed.</w:t>
+        <w:t xml:space="preserve"> (kuantorflow #57; ai_agent #42): gitignore hardening so per-user chat logs can never be accidentally committed.</w:t>
       </w:r>
     </w:p>
     <w:p>
@@ -740,6 +1012,12 @@
         <w:pStyle w:val="Heading2"/>
       </w:pPr>
       <w:r>
+        <w:rPr>
+          <w:b w:val="0"/>
+          <w:i w:val="0"/>
+          <w:color w:val="22303C"/>
+          <w:sz w:val="25"/>
+        </w:rPr>
         <w:t>5. Identity &amp; personalization (kuantorflow #41, #43; ai_agent #29)</w:t>
       </w:r>
     </w:p>
@@ -753,16 +1031,18 @@
           <w:b/>
           <w:i w:val="0"/>
           <w:color w:val="22303C"/>
+          <w:sz w:val="22"/>
         </w:rPr>
-        <w:t xml:space="preserve">Optional “Sign in with Google” </w:t>
+        <w:t>Optional "Sign in with Google"</w:t>
       </w:r>
       <w:r>
         <w:rPr>
           <w:b w:val="0"/>
           <w:i w:val="0"/>
           <w:color w:val="22303C"/>
+          <w:sz w:val="22"/>
         </w:rPr>
-        <w:t>(OAuth 2.0 / OpenID Connect via Authlib) with an accept-or-decline consent popup — anonymous use remains fully supported, and the identity lives only in the session cookie, never in the database.</w:t>
+        <w:t xml:space="preserve"> (OAuth 2.0 / OpenID Connect via Authlib) with an accept-or-decline consent popup — anonymous use remains fully supported, and the identity lives only in the session cookie, never in the database.</w:t>
       </w:r>
     </w:p>
     <w:p>
@@ -772,19 +1052,48 @@
       </w:pPr>
       <w:r>
         <w:rPr>
+          <w:b w:val="0"/>
+          <w:i w:val="0"/>
+          <w:color w:val="22303C"/>
+          <w:sz w:val="22"/>
+        </w:rPr>
+        <w:t xml:space="preserve">Sign-in persists </w:t>
+      </w:r>
+      <w:r>
+        <w:rPr>
           <w:b/>
           <w:i w:val="0"/>
           <w:color w:val="22303C"/>
+          <w:sz w:val="22"/>
         </w:rPr>
-        <w:t xml:space="preserve">Persistent, personal sessions: </w:t>
+        <w:t>30 days</w:t>
       </w:r>
       <w:r>
         <w:rPr>
           <w:b w:val="0"/>
           <w:i w:val="0"/>
           <w:color w:val="22303C"/>
+          <w:sz w:val="22"/>
         </w:rPr>
-        <w:t>sign-in persists 30 days across browser restarts; Mykola greets by full name and addresses the user by first name in conversation (with prompt-injection hardening on the name).</w:t>
+        <w:t xml:space="preserve"> across browser restarts; Mykola greets by full name and addresses the user by </w:t>
+      </w:r>
+      <w:r>
+        <w:rPr>
+          <w:b/>
+          <w:i w:val="0"/>
+          <w:color w:val="22303C"/>
+          <w:sz w:val="22"/>
+        </w:rPr>
+        <w:t>first name</w:t>
+      </w:r>
+      <w:r>
+        <w:rPr>
+          <w:b w:val="0"/>
+          <w:i w:val="0"/>
+          <w:color w:val="22303C"/>
+          <w:sz w:val="22"/>
+        </w:rPr>
+        <w:t xml:space="preserve"> in conversation (with prompt-injection hardening on the name).</w:t>
       </w:r>
     </w:p>
     <w:p>
@@ -792,6 +1101,12 @@
         <w:pStyle w:val="Heading2"/>
       </w:pPr>
       <w:r>
+        <w:rPr>
+          <w:b w:val="0"/>
+          <w:i w:val="0"/>
+          <w:color w:val="22303C"/>
+          <w:sz w:val="25"/>
+        </w:rPr>
         <w:t>6. The Mykola transformation (ai_agent #27, #32, #34, #36, #41; kuantorflow #47)</w:t>
       </w:r>
     </w:p>
@@ -804,6 +1119,7 @@
           <w:b w:val="0"/>
           <w:i w:val="0"/>
           <w:color w:val="22303C"/>
+          <w:sz w:val="22"/>
         </w:rPr>
         <w:t xml:space="preserve">The agent's persona evolved from Tynna to </w:t>
       </w:r>
@@ -812,6 +1128,7 @@
           <w:b/>
           <w:i w:val="0"/>
           <w:color w:val="22303C"/>
+          <w:sz w:val="22"/>
         </w:rPr>
         <w:t>Mykola</w:t>
       </w:r>
@@ -820,8 +1137,9 @@
           <w:b w:val="0"/>
           <w:i w:val="0"/>
           <w:color w:val="22303C"/>
+          <w:sz w:val="22"/>
         </w:rPr>
-        <w:t xml:space="preserve"> — a distinguished gentleman named in honour of composer Mykola Leontovych (“Shchedryk” / “Carol of the Bells”):</w:t>
+        <w:t xml:space="preserve"> — a distinguished gentleman named in honour of composer Mykola Leontovych ("Shchedryk" / "Carol of the Bells"):</w:t>
       </w:r>
     </w:p>
     <w:p>
@@ -834,6 +1152,7 @@
           <w:b w:val="0"/>
           <w:i w:val="0"/>
           <w:color w:val="22303C"/>
+          <w:sz w:val="22"/>
         </w:rPr>
         <w:t>Full cross-repo rename: code, routes, templates, CSS, assets, log directories.</w:t>
       </w:r>
@@ -848,16 +1167,36 @@
           <w:b/>
           <w:i w:val="0"/>
           <w:color w:val="22303C"/>
+          <w:sz w:val="22"/>
         </w:rPr>
-        <w:t xml:space="preserve">A voice guide, not just a bio (#36): </w:t>
+        <w:t>A voice guide, not just a bio</w:t>
       </w:r>
       <w:r>
         <w:rPr>
           <w:b w:val="0"/>
           <w:i w:val="0"/>
           <w:color w:val="22303C"/>
+          <w:sz w:val="22"/>
         </w:rPr>
-        <w:t>British lexicon and courtesy patterns, few-shot example exchanges, moderation rules (one flourish per reply, clarity first), plus three new knowledge-base documents (French–English connections, British English, music-based learning) so the persona's signature moves are retrieved and cited, not improvised.</w:t>
+        <w:t xml:space="preserve"> (#36): British lexicon and courtesy patterns, few-shot example exchanges, moderation rules (one flourish per reply, clarity first), plus three new knowledge-base documents (French–English connections, British English, music-based learning) so the persona's signature moves are </w:t>
+      </w:r>
+      <w:r>
+        <w:rPr>
+          <w:b w:val="0"/>
+          <w:i/>
+          <w:color w:val="22303C"/>
+          <w:sz w:val="22"/>
+        </w:rPr>
+        <w:t>retrieved and cited</w:t>
+      </w:r>
+      <w:r>
+        <w:rPr>
+          <w:b w:val="0"/>
+          <w:i w:val="0"/>
+          <w:color w:val="22303C"/>
+          <w:sz w:val="22"/>
+        </w:rPr>
+        <w:t>, not improvised.</w:t>
       </w:r>
     </w:p>
     <w:p>
@@ -870,8 +1209,9 @@
           <w:b w:val="0"/>
           <w:i w:val="0"/>
           <w:color w:val="22303C"/>
+          <w:sz w:val="22"/>
         </w:rPr>
-        <w:t>Symbolic birthday with dynamic age (#41); copyright-aware musical style (titles, themes, short fragments — never full lyrics).</w:t>
+        <w:t>Symbolic birthday with dynamic age (#41), copyright-aware musical style (titles, themes, short fragments — never full lyrics).</w:t>
       </w:r>
     </w:p>
     <w:p>
@@ -879,6 +1219,12 @@
         <w:pStyle w:val="Heading2"/>
       </w:pPr>
       <w:r>
+        <w:rPr>
+          <w:b w:val="0"/>
+          <w:i w:val="0"/>
+          <w:color w:val="22303C"/>
+          <w:sz w:val="25"/>
+        </w:rPr>
         <w:t>7. Agent capabilities: acting, remembering, staying current</w:t>
       </w:r>
     </w:p>
@@ -892,16 +1238,56 @@
           <w:b/>
           <w:i w:val="0"/>
           <w:color w:val="22303C"/>
+          <w:sz w:val="22"/>
         </w:rPr>
-        <w:t xml:space="preserve">Tool use (ai_agent #37; kuantorflow #48): </w:t>
+        <w:t>Tool use</w:t>
       </w:r>
       <w:r>
         <w:rPr>
           <w:b w:val="0"/>
           <w:i w:val="0"/>
           <w:color w:val="22303C"/>
+          <w:sz w:val="22"/>
         </w:rPr>
-        <w:t>a real add_flashcard tool — when asked, Mykola fills all nine card fields himself (POS, definition, UA + RU translations and examples, topic) and saves through the same save_flashcard mechanism as the site's own flows, injected by kuantorflow.</w:t>
+        <w:t xml:space="preserve"> (ai_agent #37; kuantorflow #48): a real </w:t>
+      </w:r>
+      <w:r>
+        <w:rPr>
+          <w:rFonts w:ascii="Consolas" w:hAnsi="Consolas"/>
+          <w:b w:val="0"/>
+          <w:i w:val="0"/>
+          <w:color w:val="22303C"/>
+          <w:sz w:val="22"/>
+        </w:rPr>
+        <w:t>add_flashcard</w:t>
+      </w:r>
+      <w:r>
+        <w:rPr>
+          <w:b w:val="0"/>
+          <w:i w:val="0"/>
+          <w:color w:val="22303C"/>
+          <w:sz w:val="22"/>
+        </w:rPr>
+        <w:t xml:space="preserve"> tool — when asked, Mykola fills all nine card fields himself (POS, definition, UA + RU translations and examples, topic) and saves through the same </w:t>
+      </w:r>
+      <w:r>
+        <w:rPr>
+          <w:rFonts w:ascii="Consolas" w:hAnsi="Consolas"/>
+          <w:b w:val="0"/>
+          <w:i w:val="0"/>
+          <w:color w:val="22303C"/>
+          <w:sz w:val="22"/>
+        </w:rPr>
+        <w:t>save_flashcard</w:t>
+      </w:r>
+      <w:r>
+        <w:rPr>
+          <w:b w:val="0"/>
+          <w:i w:val="0"/>
+          <w:color w:val="22303C"/>
+          <w:sz w:val="22"/>
+        </w:rPr>
+        <w:t xml:space="preserve"> mechanism as the site's own flows, injected by kuantorflow (dependency direction preserved).</w:t>
       </w:r>
     </w:p>
     <w:p>
@@ -914,16 +1300,37 @@
           <w:b/>
           <w:i w:val="0"/>
           <w:color w:val="22303C"/>
+          <w:sz w:val="22"/>
         </w:rPr>
-        <w:t xml:space="preserve">Per-user memory (kuantorflow #52; ai_agent #38): </w:t>
+        <w:t>Per-user memory</w:t>
       </w:r>
       <w:r>
         <w:rPr>
           <w:b w:val="0"/>
           <w:i w:val="0"/>
           <w:color w:val="22303C"/>
+          <w:sz w:val="22"/>
         </w:rPr>
-        <w:t>signed-in users' chats are logged per account; on return, Mykola opens with a recap of previous conversations plus suggested follow-ups.</w:t>
+        <w:t xml:space="preserve"> (kuantorflow #52; ai_agent #38): signed-in users' chats are logged to </w:t>
+      </w:r>
+      <w:r>
+        <w:rPr>
+          <w:rFonts w:ascii="Consolas" w:hAnsi="Consolas"/>
+          <w:b w:val="0"/>
+          <w:i w:val="0"/>
+          <w:color w:val="22303C"/>
+          <w:sz w:val="22"/>
+        </w:rPr>
+        <w:t>mykola_logs/&lt;email_prefix&gt;/</w:t>
+      </w:r>
+      <w:r>
+        <w:rPr>
+          <w:b w:val="0"/>
+          <w:i w:val="0"/>
+          <w:color w:val="22303C"/>
+          <w:sz w:val="22"/>
+        </w:rPr>
+        <w:t>; on return, Mykola opens with a recap of previous conversations plus suggested follow-ups.</w:t>
       </w:r>
     </w:p>
     <w:p>
@@ -936,16 +1343,36 @@
           <w:b/>
           <w:i w:val="0"/>
           <w:color w:val="22303C"/>
+          <w:sz w:val="22"/>
         </w:rPr>
-        <w:t xml:space="preserve">Focused context (kuantorflow #59; ai_agent #44): </w:t>
+        <w:t>Focused context</w:t>
       </w:r>
       <w:r>
         <w:rPr>
           <w:b w:val="0"/>
           <w:i w:val="0"/>
           <w:color w:val="22303C"/>
+          <w:sz w:val="22"/>
         </w:rPr>
-        <w:t>recaps read only the 3 newest logs (12k-char secondary budget) and lead with the most recent topic — and if the learner already said goodbye today, Mykola deterministically wishes them a good rest instead of restarting the dialogue.</w:t>
+        <w:t xml:space="preserve"> (kuantorflow #59; ai_agent #44): recaps read only the </w:t>
+      </w:r>
+      <w:r>
+        <w:rPr>
+          <w:b/>
+          <w:i w:val="0"/>
+          <w:color w:val="22303C"/>
+          <w:sz w:val="22"/>
+        </w:rPr>
+        <w:t>3 newest logs</w:t>
+      </w:r>
+      <w:r>
+        <w:rPr>
+          <w:b w:val="0"/>
+          <w:i w:val="0"/>
+          <w:color w:val="22303C"/>
+          <w:sz w:val="22"/>
+        </w:rPr>
+        <w:t xml:space="preserve"> (12k-char secondary budget), lead with the most recent topic — and if the learner already said goodbye today, Mykola deterministically wishes them a good rest instead of restarting the dialogue.</w:t>
       </w:r>
     </w:p>
     <w:p>
@@ -958,16 +1385,37 @@
           <w:b/>
           <w:i w:val="0"/>
           <w:color w:val="22303C"/>
+          <w:sz w:val="22"/>
         </w:rPr>
-        <w:t xml:space="preserve">Readable logs (kuantorflow #58; ai_agent #43): </w:t>
+        <w:t>Readable logs</w:t>
       </w:r>
       <w:r>
         <w:rPr>
           <w:b w:val="0"/>
           <w:i w:val="0"/>
           <w:color w:val="22303C"/>
+          <w:sz w:val="22"/>
         </w:rPr>
-        <w:t>log files named by chat start time (chat_2026-07-13_11-43-03_e6f3.txt).</w:t>
+        <w:t xml:space="preserve"> (kuantorflow #58; ai_agent #43): log files named by chat start time (</w:t>
+      </w:r>
+      <w:r>
+        <w:rPr>
+          <w:rFonts w:ascii="Consolas" w:hAnsi="Consolas"/>
+          <w:b w:val="0"/>
+          <w:i w:val="0"/>
+          <w:color w:val="22303C"/>
+          <w:sz w:val="22"/>
+        </w:rPr>
+        <w:t>chat_2026-07-13_11-43-03_e6f3.txt</w:t>
+      </w:r>
+      <w:r>
+        <w:rPr>
+          <w:b w:val="0"/>
+          <w:i w:val="0"/>
+          <w:color w:val="22303C"/>
+          <w:sz w:val="22"/>
+        </w:rPr>
+        <w:t>).</w:t>
       </w:r>
     </w:p>
     <w:p>
@@ -980,16 +1428,18 @@
           <w:b/>
           <w:i w:val="0"/>
           <w:color w:val="22303C"/>
+          <w:sz w:val="22"/>
         </w:rPr>
-        <w:t xml:space="preserve">Live UI updates (kuantorflow #60): </w:t>
+        <w:t>Live UI updates</w:t>
       </w:r>
       <w:r>
         <w:rPr>
           <w:b w:val="0"/>
           <w:i w:val="0"/>
           <w:color w:val="22303C"/>
+          <w:sz w:val="22"/>
         </w:rPr>
-        <w:t>when Mykola saves a card mid-chat, the “Browse flashcards” topic chips refresh in place — no reload.</w:t>
+        <w:t xml:space="preserve"> (kuantorflow #60): when Mykola saves a card mid-chat, the "Browse flashcards" topic chips refresh in place — no reload.</w:t>
       </w:r>
     </w:p>
     <w:p>
@@ -1002,16 +1452,18 @@
           <w:b/>
           <w:i w:val="0"/>
           <w:color w:val="22303C"/>
+          <w:sz w:val="22"/>
         </w:rPr>
-        <w:t xml:space="preserve">Widget-state persistence (kuantorflow #64; ai_agent #45, #46): </w:t>
+        <w:t>Widget-state persistence</w:t>
       </w:r>
       <w:r>
         <w:rPr>
           <w:b w:val="0"/>
           <w:i w:val="0"/>
           <w:color w:val="22303C"/>
+          <w:sz w:val="22"/>
         </w:rPr>
-        <w:t>the chat survives internal page navigation, keeping its history and open/maximized state.</w:t>
+        <w:t xml:space="preserve"> (kuantorflow #64; ai_agent #45, #46): the chat survives internal page navigation, keeping its history and open/maximized state.</w:t>
       </w:r>
     </w:p>
     <w:p>
@@ -1019,6 +1471,12 @@
         <w:pStyle w:val="Heading2"/>
       </w:pPr>
       <w:r>
+        <w:rPr>
+          <w:b w:val="0"/>
+          <w:i w:val="0"/>
+          <w:color w:val="22303C"/>
+          <w:sz w:val="25"/>
+        </w:rPr>
         <w:t>8. Content workflow &amp; visual identity</w:t>
       </w:r>
     </w:p>
@@ -1032,16 +1490,18 @@
           <w:b/>
           <w:i w:val="0"/>
           <w:color w:val="22303C"/>
+          <w:sz w:val="22"/>
         </w:rPr>
-        <w:t xml:space="preserve">MHT two-column review (kuantorflow #44): </w:t>
+        <w:t>MHT two-column review</w:t>
       </w:r>
       <w:r>
         <w:rPr>
           <w:b w:val="0"/>
           <w:i w:val="0"/>
           <w:color w:val="22303C"/>
+          <w:sz w:val="22"/>
         </w:rPr>
-        <w:t>file uploads no longer auto-save — a popup shows the source text beside editable parsed cards with per-card delete and an “Add All” button.</w:t>
+        <w:t xml:space="preserve"> (kuantorflow #44): file uploads no longer auto-save — a popup shows the source text beside editable parsed cards with per-card delete and an "Add All" button.</w:t>
       </w:r>
     </w:p>
     <w:p>
@@ -1054,16 +1514,18 @@
           <w:b/>
           <w:i w:val="0"/>
           <w:color w:val="22303C"/>
+          <w:sz w:val="22"/>
         </w:rPr>
-        <w:t xml:space="preserve">Imagery refresh (kuantorflow #50, #51): </w:t>
+        <w:t>Imagery refresh</w:t>
       </w:r>
       <w:r>
         <w:rPr>
           <w:b w:val="0"/>
           <w:i w:val="0"/>
           <w:color w:val="22303C"/>
+          <w:sz w:val="22"/>
         </w:rPr>
-        <w:t>new icon, main artwork, and backgrounds for the Mykola era.</w:t>
+        <w:t xml:space="preserve"> (kuantorflow #50, #51): new icon, main artwork, and backgrounds for the Mykola era.</w:t>
       </w:r>
     </w:p>
     <w:p>
@@ -1071,6 +1533,12 @@
         <w:pStyle w:val="Heading2"/>
       </w:pPr>
       <w:r>
+        <w:rPr>
+          <w:b w:val="0"/>
+          <w:i w:val="0"/>
+          <w:color w:val="22303C"/>
+          <w:sz w:val="25"/>
+        </w:rPr>
         <w:t>9. Quality &amp; operations (kuantorflow_automation #1, #3)</w:t>
       </w:r>
     </w:p>
@@ -1084,16 +1552,18 @@
           <w:b/>
           <w:i w:val="0"/>
           <w:color w:val="22303C"/>
+          <w:sz w:val="22"/>
         </w:rPr>
-        <w:t xml:space="preserve">pytest suite (#1): </w:t>
+        <w:t>pytest suite</w:t>
       </w:r>
       <w:r>
         <w:rPr>
           <w:b w:val="0"/>
           <w:i w:val="0"/>
           <w:color w:val="22303C"/>
+          <w:sz w:val="22"/>
         </w:rPr>
-        <w:t>app regression tests plus live-site smoke tests.</w:t>
+        <w:t xml:space="preserve"> (#1): app regression tests plus live-site smoke tests.</w:t>
       </w:r>
     </w:p>
     <w:p>
@@ -1106,23 +1576,38 @@
           <w:b/>
           <w:i w:val="0"/>
           <w:color w:val="22303C"/>
+          <w:sz w:val="22"/>
         </w:rPr>
-        <w:t xml:space="preserve">Daily database backups (#3): </w:t>
+        <w:t>Daily database backups</w:t>
       </w:r>
       <w:r>
         <w:rPr>
           <w:b w:val="0"/>
           <w:i w:val="0"/>
           <w:color w:val="22303C"/>
+          <w:sz w:val="22"/>
         </w:rPr>
-        <w:t>scheduled dump script for the production MySQL.</w:t>
+        <w:t xml:space="preserve"> (#3): scheduled dump script for the production MySQL.</w:t>
       </w:r>
+    </w:p>
+    <w:p>
+      <w:pPr>
+        <w:pBdr>
+          <w:bottom w:val="single" w:sz="8" w:color="D9B13C"/>
+        </w:pBdr>
+      </w:pPr>
     </w:p>
     <w:p>
       <w:pPr>
         <w:pStyle w:val="Heading1"/>
       </w:pPr>
       <w:r>
+        <w:rPr>
+          <w:b w:val="0"/>
+          <w:i w:val="0"/>
+          <w:color w:val="2E6BA0"/>
+          <w:sz w:val="30"/>
+        </w:rPr>
         <w:t>Technical Highlights</w:t>
       </w:r>
     </w:p>
@@ -1136,16 +1621,37 @@
           <w:b/>
           <w:i w:val="0"/>
           <w:color w:val="22303C"/>
+          <w:sz w:val="22"/>
         </w:rPr>
-        <w:t xml:space="preserve">Two-repo composition without duplication. </w:t>
+        <w:t>Two-repo composition without duplication.</w:t>
       </w:r>
       <w:r>
         <w:rPr>
           <w:b w:val="0"/>
           <w:i w:val="0"/>
           <w:color w:val="22303C"/>
+          <w:sz w:val="22"/>
         </w:rPr>
-        <w:t>The site imports the agent class, renders the agent repo's templates through a ChoiceLoader, and serves its media through dedicated routes — one source of truth for code, prose, and assets.</w:t>
+        <w:t xml:space="preserve"> The site imports the agent class, renders the agent repo's templates through a </w:t>
+      </w:r>
+      <w:r>
+        <w:rPr>
+          <w:rFonts w:ascii="Consolas" w:hAnsi="Consolas"/>
+          <w:b w:val="0"/>
+          <w:i w:val="0"/>
+          <w:color w:val="22303C"/>
+          <w:sz w:val="22"/>
+        </w:rPr>
+        <w:t>ChoiceLoader</w:t>
+      </w:r>
+      <w:r>
+        <w:rPr>
+          <w:b w:val="0"/>
+          <w:i w:val="0"/>
+          <w:color w:val="22303C"/>
+          <w:sz w:val="22"/>
+        </w:rPr>
+        <w:t>, and serves its media through dedicated routes — one source of truth for code, prose, and assets.</w:t>
       </w:r>
     </w:p>
     <w:p>
@@ -1158,16 +1664,56 @@
           <w:b/>
           <w:i w:val="0"/>
           <w:color w:val="22303C"/>
+          <w:sz w:val="22"/>
         </w:rPr>
-        <w:t xml:space="preserve">Feature-detected rollouts. </w:t>
+        <w:t>Feature-detected rollouts.</w:t>
       </w:r>
       <w:r>
         <w:rPr>
           <w:b w:val="0"/>
           <w:i w:val="0"/>
           <w:color w:val="22303C"/>
+          <w:sz w:val="22"/>
         </w:rPr>
-        <w:t>Cross-repo integrations probe capabilities at runtime (inspect.signature, hasattr) so the two repositories can merge and deploy in any order without breaking each other.</w:t>
+        <w:t xml:space="preserve"> Cross-repo integrations probe capabilities at runtime (</w:t>
+      </w:r>
+      <w:r>
+        <w:rPr>
+          <w:rFonts w:ascii="Consolas" w:hAnsi="Consolas"/>
+          <w:b w:val="0"/>
+          <w:i w:val="0"/>
+          <w:color w:val="22303C"/>
+          <w:sz w:val="22"/>
+        </w:rPr>
+        <w:t>inspect.signature</w:t>
+      </w:r>
+      <w:r>
+        <w:rPr>
+          <w:b w:val="0"/>
+          <w:i w:val="0"/>
+          <w:color w:val="22303C"/>
+          <w:sz w:val="22"/>
+        </w:rPr>
+        <w:t xml:space="preserve">, </w:t>
+      </w:r>
+      <w:r>
+        <w:rPr>
+          <w:rFonts w:ascii="Consolas" w:hAnsi="Consolas"/>
+          <w:b w:val="0"/>
+          <w:i w:val="0"/>
+          <w:color w:val="22303C"/>
+          <w:sz w:val="22"/>
+        </w:rPr>
+        <w:t>hasattr</w:t>
+      </w:r>
+      <w:r>
+        <w:rPr>
+          <w:b w:val="0"/>
+          <w:i w:val="0"/>
+          <w:color w:val="22303C"/>
+          <w:sz w:val="22"/>
+        </w:rPr>
+        <w:t>) so the two repositories can merge and deploy in any order without breaking each other.</w:t>
       </w:r>
     </w:p>
     <w:p>
@@ -1180,16 +1726,37 @@
           <w:b/>
           <w:i w:val="0"/>
           <w:color w:val="22303C"/>
+          <w:sz w:val="22"/>
         </w:rPr>
-        <w:t xml:space="preserve">Dependency injection at the seam. </w:t>
+        <w:t>Dependency injection at the seam.</w:t>
       </w:r>
       <w:r>
         <w:rPr>
           <w:b w:val="0"/>
           <w:i w:val="0"/>
           <w:color w:val="22303C"/>
+          <w:sz w:val="22"/>
         </w:rPr>
-        <w:t>kuantorflow injects its own save_flashcard into the agent's tool executor — the agent stays storage-agnostic; the site keeps one write path for all card sources.</w:t>
+        <w:t xml:space="preserve"> kuantorflow injects its own </w:t>
+      </w:r>
+      <w:r>
+        <w:rPr>
+          <w:rFonts w:ascii="Consolas" w:hAnsi="Consolas"/>
+          <w:b w:val="0"/>
+          <w:i w:val="0"/>
+          <w:color w:val="22303C"/>
+          <w:sz w:val="22"/>
+        </w:rPr>
+        <w:t>save_flashcard</w:t>
+      </w:r>
+      <w:r>
+        <w:rPr>
+          <w:b w:val="0"/>
+          <w:i w:val="0"/>
+          <w:color w:val="22303C"/>
+          <w:sz w:val="22"/>
+        </w:rPr>
+        <w:t xml:space="preserve"> into the agent's tool executor — the agent stays storage-agnostic; the site keeps one write path for all card sources.</w:t>
       </w:r>
     </w:p>
     <w:p>
@@ -1202,16 +1769,18 @@
           <w:b/>
           <w:i w:val="0"/>
           <w:color w:val="22303C"/>
+          <w:sz w:val="22"/>
         </w:rPr>
-        <w:t xml:space="preserve">LLM engineering in production: </w:t>
+        <w:t>LLM engineering in production</w:t>
       </w:r>
       <w:r>
         <w:rPr>
           <w:b w:val="0"/>
           <w:i w:val="0"/>
           <w:color w:val="22303C"/>
+          <w:sz w:val="22"/>
         </w:rPr>
-        <w:t>TF-IDF RAG with citations, a streaming tool-use loop, persona/voice prompt engineering with few-shot examples, and defense-in-depth against prompt injection (names reduced to a single token, tool inputs sanitized to a whitelist).</w:t>
+        <w:t>: TF-IDF RAG with citations, a streaming tool-use loop, persona/voice prompt engineering with few-shot examples, and defense-in-depth against prompt injection (names reduced to a single token, tool inputs sanitized to a whitelist).</w:t>
       </w:r>
     </w:p>
     <w:p>
@@ -1224,16 +1793,18 @@
           <w:b/>
           <w:i w:val="0"/>
           <w:color w:val="22303C"/>
+          <w:sz w:val="22"/>
         </w:rPr>
-        <w:t xml:space="preserve">Deterministic where determinism wins. </w:t>
+        <w:t>Deterministic where determinism wins.</w:t>
       </w:r>
       <w:r>
         <w:rPr>
           <w:b w:val="0"/>
           <w:i w:val="0"/>
           <w:color w:val="22303C"/>
+          <w:sz w:val="22"/>
         </w:rPr>
-        <w:t>Farewell detection, date checks, and the goodnight reply are plain string/date logic — no model call, fully testable.</w:t>
+        <w:t xml:space="preserve"> Farewell detection, date checks, and the goodnight reply are plain string/date logic — no model call, fully testable.</w:t>
       </w:r>
     </w:p>
     <w:p>
@@ -1246,16 +1817,37 @@
           <w:b/>
           <w:i w:val="0"/>
           <w:color w:val="22303C"/>
+          <w:sz w:val="22"/>
         </w:rPr>
-        <w:t xml:space="preserve">Security throughout: </w:t>
+        <w:t>Security throughout</w:t>
       </w:r>
       <w:r>
         <w:rPr>
           <w:b w:val="0"/>
           <w:i w:val="0"/>
           <w:color w:val="22303C"/>
+          <w:sz w:val="22"/>
         </w:rPr>
-        <w:t>parameterized SQL everywhere, XSS-safe DOM building for user-controlled strings, OAuth CSRF handled by Authlib, per-endpoint request caps, secrets in .env only, and consent copy kept honest as storage semantics changed.</w:t>
+        <w:t xml:space="preserve">: parameterized SQL everywhere, XSS-safe DOM building for user-controlled strings, OAuth CSRF handled by Authlib, per-endpoint request caps, secrets in </w:t>
+      </w:r>
+      <w:r>
+        <w:rPr>
+          <w:rFonts w:ascii="Consolas" w:hAnsi="Consolas"/>
+          <w:b w:val="0"/>
+          <w:i w:val="0"/>
+          <w:color w:val="22303C"/>
+          <w:sz w:val="22"/>
+        </w:rPr>
+        <w:t>.env</w:t>
+      </w:r>
+      <w:r>
+        <w:rPr>
+          <w:b w:val="0"/>
+          <w:i w:val="0"/>
+          <w:color w:val="22303C"/>
+          <w:sz w:val="22"/>
+        </w:rPr>
+        <w:t xml:space="preserve"> only, and consent copy kept honest as storage semantics changed.</w:t>
       </w:r>
     </w:p>
     <w:p>
@@ -1263,6 +1855,12 @@
         <w:pStyle w:val="Heading1"/>
       </w:pPr>
       <w:r>
+        <w:rPr>
+          <w:b w:val="0"/>
+          <w:i w:val="0"/>
+          <w:color w:val="2E6BA0"/>
+          <w:sz w:val="30"/>
+        </w:rPr>
         <w:t>Lessons Learned</w:t>
       </w:r>
     </w:p>
@@ -1276,16 +1874,37 @@
           <w:b/>
           <w:i w:val="0"/>
           <w:color w:val="22303C"/>
+          <w:sz w:val="22"/>
         </w:rPr>
-        <w:t xml:space="preserve">Wheel availability is the real Python-version constraint. </w:t>
+        <w:t>Wheel availability is the real Python-version constraint.</w:t>
       </w:r>
       <w:r>
         <w:rPr>
           <w:b w:val="0"/>
           <w:i w:val="0"/>
           <w:color w:val="22303C"/>
+          <w:sz w:val="22"/>
         </w:rPr>
-        <w:t>A “Visual C++ required” error almost always means a pinned package predates your interpreter (cpXYZ in the wheel name tells the story) — bump the pin, don't install a compiler. The same lesson set production's Python 3.13 floor via numpy/scipy.</w:t>
+        <w:t xml:space="preserve"> A "Visual C++ required" error almost always means a pinned package predates your interpreter (</w:t>
+      </w:r>
+      <w:r>
+        <w:rPr>
+          <w:rFonts w:ascii="Consolas" w:hAnsi="Consolas"/>
+          <w:b w:val="0"/>
+          <w:i w:val="0"/>
+          <w:color w:val="22303C"/>
+          <w:sz w:val="22"/>
+        </w:rPr>
+        <w:t>cpXYZ</w:t>
+      </w:r>
+      <w:r>
+        <w:rPr>
+          <w:b w:val="0"/>
+          <w:i w:val="0"/>
+          <w:color w:val="22303C"/>
+          <w:sz w:val="22"/>
+        </w:rPr>
+        <w:t xml:space="preserve"> in the wheel name tells the story) — bump the pin, don't install a compiler. The same lesson set production's Python 3.13 floor via numpy/scipy.</w:t>
       </w:r>
     </w:p>
     <w:p>
@@ -1298,16 +1917,37 @@
           <w:b/>
           <w:i w:val="0"/>
           <w:color w:val="22303C"/>
+          <w:sz w:val="22"/>
         </w:rPr>
-        <w:t xml:space="preserve">Same-name asset swaps fight browser caches. </w:t>
+        <w:t>Same-name asset swaps fight browser caches.</w:t>
       </w:r>
       <w:r>
         <w:rPr>
           <w:b w:val="0"/>
           <w:i w:val="0"/>
           <w:color w:val="22303C"/>
+          <w:sz w:val="22"/>
         </w:rPr>
-        <w:t>Refreshing background.jpg and the favicon in place required hard refreshes; version query-strings are the durable fix.</w:t>
+        <w:t xml:space="preserve"> Refreshing </w:t>
+      </w:r>
+      <w:r>
+        <w:rPr>
+          <w:rFonts w:ascii="Consolas" w:hAnsi="Consolas"/>
+          <w:b w:val="0"/>
+          <w:i w:val="0"/>
+          <w:color w:val="22303C"/>
+          <w:sz w:val="22"/>
+        </w:rPr>
+        <w:t>background.jpg</w:t>
+      </w:r>
+      <w:r>
+        <w:rPr>
+          <w:b w:val="0"/>
+          <w:i w:val="0"/>
+          <w:color w:val="22303C"/>
+          <w:sz w:val="22"/>
+        </w:rPr>
+        <w:t xml:space="preserve"> and the favicon in place required hard refreshes; version query-strings are the durable fix.</w:t>
       </w:r>
     </w:p>
     <w:p>
@@ -1320,16 +1960,18 @@
           <w:b/>
           <w:i w:val="0"/>
           <w:color w:val="22303C"/>
+          <w:sz w:val="22"/>
         </w:rPr>
-        <w:t xml:space="preserve">Keep disclosure in sync with behavior. </w:t>
+        <w:t>Keep disclosure in sync with behavior.</w:t>
       </w:r>
       <w:r>
         <w:rPr>
           <w:b w:val="0"/>
           <w:i w:val="0"/>
           <w:color w:val="22303C"/>
+          <w:sz w:val="22"/>
         </w:rPr>
-        <w:t>When per-user chat storage arrived, the consent popup's “nothing is stored on our server” had to change the same day — honesty is a feature requirement, not an afterthought.</w:t>
+        <w:t xml:space="preserve"> When per-user chat storage arrived, the consent popup's "nothing is stored on our server" had to change the same day — honesty is a feature requirement, not an afterthought.</w:t>
       </w:r>
     </w:p>
     <w:p>
@@ -1342,16 +1984,18 @@
           <w:b/>
           <w:i w:val="0"/>
           <w:color w:val="22303C"/>
+          <w:sz w:val="22"/>
         </w:rPr>
-        <w:t xml:space="preserve">Verify with stubs, prove with one live call. </w:t>
+        <w:t>Verify with stubs, prove with one live call.</w:t>
       </w:r>
       <w:r>
         <w:rPr>
           <w:b w:val="0"/>
           <w:i w:val="0"/>
           <w:color w:val="22303C"/>
+          <w:sz w:val="22"/>
         </w:rPr>
-        <w:t>Exhaustive deterministic matrices with stubbed agents (free, fast), then a single real end-to-end call as the final proof — including cleanup of any real rows it created.</w:t>
+        <w:t xml:space="preserve"> The test pattern that worked: exhaustive deterministic matrices with stubbed agents (free, fast), then a single real end-to-end call as the final proof — including cleanup of any real rows it created.</w:t>
       </w:r>
     </w:p>
     <w:p>
@@ -1364,16 +2008,56 @@
           <w:b/>
           <w:i w:val="0"/>
           <w:color w:val="22303C"/>
+          <w:sz w:val="22"/>
         </w:rPr>
-        <w:t xml:space="preserve">Squash merges hide branch ancestry. </w:t>
+        <w:t>Squash merges hide branch ancestry.</w:t>
       </w:r>
       <w:r>
         <w:rPr>
           <w:b w:val="0"/>
           <w:i w:val="0"/>
           <w:color w:val="22303C"/>
+          <w:sz w:val="22"/>
         </w:rPr>
-        <w:t>Post-merge cleanup needs git branch -D plus PR-state verification rather than trusting -d's merged check.</w:t>
+        <w:t xml:space="preserve"> Post-merge cleanup needs </w:t>
+      </w:r>
+      <w:r>
+        <w:rPr>
+          <w:rFonts w:ascii="Consolas" w:hAnsi="Consolas"/>
+          <w:b w:val="0"/>
+          <w:i w:val="0"/>
+          <w:color w:val="22303C"/>
+          <w:sz w:val="22"/>
+        </w:rPr>
+        <w:t>git branch -D</w:t>
+      </w:r>
+      <w:r>
+        <w:rPr>
+          <w:b w:val="0"/>
+          <w:i w:val="0"/>
+          <w:color w:val="22303C"/>
+          <w:sz w:val="22"/>
+        </w:rPr>
+        <w:t xml:space="preserve"> plus PR-state verification rather than trusting </w:t>
+      </w:r>
+      <w:r>
+        <w:rPr>
+          <w:rFonts w:ascii="Consolas" w:hAnsi="Consolas"/>
+          <w:b w:val="0"/>
+          <w:i w:val="0"/>
+          <w:color w:val="22303C"/>
+          <w:sz w:val="22"/>
+        </w:rPr>
+        <w:t>-d</w:t>
+      </w:r>
+      <w:r>
+        <w:rPr>
+          <w:b w:val="0"/>
+          <w:i w:val="0"/>
+          <w:color w:val="22303C"/>
+          <w:sz w:val="22"/>
+        </w:rPr>
+        <w:t>'s merged check.</w:t>
       </w:r>
     </w:p>
     <w:p>
@@ -1386,23 +2070,76 @@
           <w:b/>
           <w:i w:val="0"/>
           <w:color w:val="22303C"/>
+          <w:sz w:val="22"/>
         </w:rPr>
-        <w:t xml:space="preserve">gitignore patterns don't recurse the way you hope. </w:t>
+        <w:t>gitignore patterns don't recurse the way you hope.</w:t>
       </w:r>
       <w:r>
         <w:rPr>
           <w:b w:val="0"/>
           <w:i w:val="0"/>
           <w:color w:val="22303C"/>
+          <w:sz w:val="22"/>
         </w:rPr>
-        <w:t>dir/chat_*.txt does not cover dir/sub/chat_*.txt — user-identified logs nearly became committable the day subdirectories appeared.</w:t>
+        <w:t xml:space="preserve"> </w:t>
       </w:r>
+      <w:r>
+        <w:rPr>
+          <w:rFonts w:ascii="Consolas" w:hAnsi="Consolas"/>
+          <w:b w:val="0"/>
+          <w:i w:val="0"/>
+          <w:color w:val="22303C"/>
+          <w:sz w:val="22"/>
+        </w:rPr>
+        <w:t>dir/chat_*.txt</w:t>
+      </w:r>
+      <w:r>
+        <w:rPr>
+          <w:b w:val="0"/>
+          <w:i w:val="0"/>
+          <w:color w:val="22303C"/>
+          <w:sz w:val="22"/>
+        </w:rPr>
+        <w:t xml:space="preserve"> does not cover </w:t>
+      </w:r>
+      <w:r>
+        <w:rPr>
+          <w:rFonts w:ascii="Consolas" w:hAnsi="Consolas"/>
+          <w:b w:val="0"/>
+          <w:i w:val="0"/>
+          <w:color w:val="22303C"/>
+          <w:sz w:val="22"/>
+        </w:rPr>
+        <w:t>dir/sub/chat_*.txt</w:t>
+      </w:r>
+      <w:r>
+        <w:rPr>
+          <w:b w:val="0"/>
+          <w:i w:val="0"/>
+          <w:color w:val="22303C"/>
+          <w:sz w:val="22"/>
+        </w:rPr>
+        <w:t xml:space="preserve"> — user-identified logs nearly became committable the day subdirectories appeared.</w:t>
+      </w:r>
+    </w:p>
+    <w:p>
+      <w:pPr>
+        <w:pBdr>
+          <w:bottom w:val="single" w:sz="8" w:color="D9B13C"/>
+        </w:pBdr>
+      </w:pPr>
     </w:p>
     <w:p>
       <w:pPr>
         <w:pStyle w:val="Heading1"/>
       </w:pPr>
       <w:r>
+        <w:rPr>
+          <w:b w:val="0"/>
+          <w:i w:val="0"/>
+          <w:color w:val="2E6BA0"/>
+          <w:sz w:val="30"/>
+        </w:rPr>
         <w:t>Plans for Next Week</w:t>
       </w:r>
     </w:p>
@@ -1414,10 +2151,28 @@
         <w:rPr>
           <w:b w:val="0"/>
           <w:i/>
-          <w:color w:val="5B6B7A"/>
-          <w:sz w:val="20"/>
+          <w:color w:val="22303C"/>
+          <w:sz w:val="22"/>
         </w:rPr>
-        <w:t>Statuses taken directly from the “KuantorFlow Improvements” GitHub Projects board (excluding this report's own ticket, kuantorflow#63, which the board lists as In Progress). The board also tracks 31 items as Done, matching the completed work summarized above.</w:t>
+        <w:t xml:space="preserve">Statuses taken directly from the </w:t>
+      </w:r>
+      <w:r>
+        <w:rPr>
+          <w:b w:val="0"/>
+          <w:i/>
+          <w:color w:val="22303C"/>
+          <w:sz w:val="22"/>
+        </w:rPr>
+        <w:t>KuantorFlow Improvements</w:t>
+      </w:r>
+      <w:r>
+        <w:rPr>
+          <w:b w:val="0"/>
+          <w:i/>
+          <w:color w:val="22303C"/>
+          <w:sz w:val="22"/>
+        </w:rPr>
+        <w:t xml:space="preserve"> GitHub Projects board (excluding this report's own ticket, kuantorflow#63, which the board lists as In Progress). The board also tracks 31 items as Done, matching the completed work summarized above.</w:t>
       </w:r>
     </w:p>
     <w:p>
@@ -1425,6 +2180,12 @@
         <w:pStyle w:val="Heading2"/>
       </w:pPr>
       <w:r>
+        <w:rPr>
+          <w:b w:val="0"/>
+          <w:i w:val="0"/>
+          <w:color w:val="22303C"/>
+          <w:sz w:val="25"/>
+        </w:rPr>
         <w:t>In Progress</w:t>
       </w:r>
     </w:p>
@@ -1444,13 +2205,14 @@
       <w:tr>
         <w:tc>
           <w:tcPr>
-            <w:tcW w:type="dxa" w:w="2160"/>
+            <w:tcW w:type="dxa" w:w="1210"/>
             <w:shd w:val="clear" w:fill="2E6BA0"/>
           </w:tcPr>
           <w:p>
             <w:r>
               <w:rPr>
                 <w:b/>
+                <w:i w:val="0"/>
                 <w:color w:val="FFFFFF"/>
                 <w:sz w:val="20"/>
               </w:rPr>
@@ -1460,13 +2222,14 @@
         </w:tc>
         <w:tc>
           <w:tcPr>
-            <w:tcW w:type="dxa" w:w="1296"/>
+            <w:tcW w:type="dxa" w:w="990"/>
             <w:shd w:val="clear" w:fill="2E6BA0"/>
           </w:tcPr>
           <w:p>
             <w:r>
               <w:rPr>
                 <w:b/>
+                <w:i w:val="0"/>
                 <w:color w:val="FFFFFF"/>
                 <w:sz w:val="20"/>
               </w:rPr>
@@ -1476,13 +2239,14 @@
         </w:tc>
         <w:tc>
           <w:tcPr>
-            <w:tcW w:type="dxa" w:w="6624"/>
+            <w:tcW w:type="dxa" w:w="7592"/>
             <w:shd w:val="clear" w:fill="2E6BA0"/>
           </w:tcPr>
           <w:p>
             <w:r>
               <w:rPr>
                 <w:b/>
+                <w:i w:val="0"/>
                 <w:color w:val="FFFFFF"/>
                 <w:sz w:val="20"/>
               </w:rPr>
@@ -1494,11 +2258,13 @@
       <w:tr>
         <w:tc>
           <w:tcPr>
-            <w:tcW w:type="dxa" w:w="2160"/>
+            <w:tcW w:type="dxa" w:w="1210"/>
           </w:tcPr>
           <w:p>
             <w:r>
               <w:rPr>
+                <w:b w:val="0"/>
+                <w:i w:val="0"/>
                 <w:color w:val="22303C"/>
                 <w:sz w:val="20"/>
               </w:rPr>
@@ -1508,12 +2274,14 @@
         </w:tc>
         <w:tc>
           <w:tcPr>
-            <w:tcW w:type="dxa" w:w="1296"/>
+            <w:tcW w:type="dxa" w:w="990"/>
           </w:tcPr>
           <w:p>
             <w:r>
               <w:rPr>
-                <w:color w:val="22303C"/>
+                <w:b w:val="0"/>
+                <w:i w:val="0"/>
+                <w:color w:val="2E6BA0"/>
                 <w:sz w:val="20"/>
               </w:rPr>
               <w:t>#62</w:t>
@@ -1522,11 +2290,13 @@
         </w:tc>
         <w:tc>
           <w:tcPr>
-            <w:tcW w:type="dxa" w:w="6624"/>
+            <w:tcW w:type="dxa" w:w="7592"/>
           </w:tcPr>
           <w:p>
             <w:r>
               <w:rPr>
+                <w:b w:val="0"/>
+                <w:i w:val="0"/>
                 <w:color w:val="22303C"/>
                 <w:sz w:val="20"/>
               </w:rPr>
@@ -1538,11 +2308,13 @@
       <w:tr>
         <w:tc>
           <w:tcPr>
-            <w:tcW w:type="dxa" w:w="2160"/>
+            <w:tcW w:type="dxa" w:w="1210"/>
           </w:tcPr>
           <w:p>
             <w:r>
               <w:rPr>
+                <w:b w:val="0"/>
+                <w:i w:val="0"/>
                 <w:color w:val="22303C"/>
                 <w:sz w:val="20"/>
               </w:rPr>
@@ -1552,12 +2324,14 @@
         </w:tc>
         <w:tc>
           <w:tcPr>
-            <w:tcW w:type="dxa" w:w="1296"/>
+            <w:tcW w:type="dxa" w:w="990"/>
           </w:tcPr>
           <w:p>
             <w:r>
               <w:rPr>
-                <w:color w:val="22303C"/>
+                <w:b w:val="0"/>
+                <w:i w:val="0"/>
+                <w:color w:val="2E6BA0"/>
                 <w:sz w:val="20"/>
               </w:rPr>
               <w:t>#54</w:t>
@@ -1566,11 +2340,13 @@
         </w:tc>
         <w:tc>
           <w:tcPr>
-            <w:tcW w:type="dxa" w:w="6624"/>
+            <w:tcW w:type="dxa" w:w="7592"/>
           </w:tcPr>
           <w:p>
             <w:r>
               <w:rPr>
+                <w:b w:val="0"/>
+                <w:i w:val="0"/>
                 <w:color w:val="22303C"/>
                 <w:sz w:val="20"/>
               </w:rPr>
@@ -1582,11 +2358,13 @@
       <w:tr>
         <w:tc>
           <w:tcPr>
-            <w:tcW w:type="dxa" w:w="2160"/>
+            <w:tcW w:type="dxa" w:w="1210"/>
           </w:tcPr>
           <w:p>
             <w:r>
               <w:rPr>
+                <w:b w:val="0"/>
+                <w:i w:val="0"/>
                 <w:color w:val="22303C"/>
                 <w:sz w:val="20"/>
               </w:rPr>
@@ -1596,12 +2374,14 @@
         </w:tc>
         <w:tc>
           <w:tcPr>
-            <w:tcW w:type="dxa" w:w="1296"/>
+            <w:tcW w:type="dxa" w:w="990"/>
           </w:tcPr>
           <w:p>
             <w:r>
               <w:rPr>
-                <w:color w:val="22303C"/>
+                <w:b w:val="0"/>
+                <w:i w:val="0"/>
+                <w:color w:val="2E6BA0"/>
                 <w:sz w:val="20"/>
               </w:rPr>
               <w:t>#55</w:t>
@@ -1610,11 +2390,13 @@
         </w:tc>
         <w:tc>
           <w:tcPr>
-            <w:tcW w:type="dxa" w:w="6624"/>
+            <w:tcW w:type="dxa" w:w="7592"/>
           </w:tcPr>
           <w:p>
             <w:r>
               <w:rPr>
+                <w:b w:val="0"/>
+                <w:i w:val="0"/>
                 <w:color w:val="22303C"/>
                 <w:sz w:val="20"/>
               </w:rPr>
@@ -1626,11 +2408,13 @@
       <w:tr>
         <w:tc>
           <w:tcPr>
-            <w:tcW w:type="dxa" w:w="2160"/>
+            <w:tcW w:type="dxa" w:w="1210"/>
           </w:tcPr>
           <w:p>
             <w:r>
               <w:rPr>
+                <w:b w:val="0"/>
+                <w:i w:val="0"/>
                 <w:color w:val="22303C"/>
                 <w:sz w:val="20"/>
               </w:rPr>
@@ -1640,12 +2424,14 @@
         </w:tc>
         <w:tc>
           <w:tcPr>
-            <w:tcW w:type="dxa" w:w="1296"/>
+            <w:tcW w:type="dxa" w:w="990"/>
           </w:tcPr>
           <w:p>
             <w:r>
               <w:rPr>
-                <w:color w:val="22303C"/>
+                <w:b w:val="0"/>
+                <w:i w:val="0"/>
+                <w:color w:val="2E6BA0"/>
                 <w:sz w:val="20"/>
               </w:rPr>
               <w:t>#46</w:t>
@@ -1654,11 +2440,13 @@
         </w:tc>
         <w:tc>
           <w:tcPr>
-            <w:tcW w:type="dxa" w:w="6624"/>
+            <w:tcW w:type="dxa" w:w="7592"/>
           </w:tcPr>
           <w:p>
             <w:r>
               <w:rPr>
+                <w:b w:val="0"/>
+                <w:i w:val="0"/>
                 <w:color w:val="22303C"/>
                 <w:sz w:val="20"/>
               </w:rPr>
@@ -1670,11 +2458,13 @@
       <w:tr>
         <w:tc>
           <w:tcPr>
-            <w:tcW w:type="dxa" w:w="2160"/>
+            <w:tcW w:type="dxa" w:w="1210"/>
           </w:tcPr>
           <w:p>
             <w:r>
               <w:rPr>
+                <w:b w:val="0"/>
+                <w:i w:val="0"/>
                 <w:color w:val="22303C"/>
                 <w:sz w:val="20"/>
               </w:rPr>
@@ -1684,12 +2474,14 @@
         </w:tc>
         <w:tc>
           <w:tcPr>
-            <w:tcW w:type="dxa" w:w="1296"/>
+            <w:tcW w:type="dxa" w:w="990"/>
           </w:tcPr>
           <w:p>
             <w:r>
               <w:rPr>
-                <w:color w:val="22303C"/>
+                <w:b w:val="0"/>
+                <w:i w:val="0"/>
+                <w:color w:val="2E6BA0"/>
                 <w:sz w:val="20"/>
               </w:rPr>
               <w:t>#45</w:t>
@@ -1698,11 +2490,13 @@
         </w:tc>
         <w:tc>
           <w:tcPr>
-            <w:tcW w:type="dxa" w:w="6624"/>
+            <w:tcW w:type="dxa" w:w="7592"/>
           </w:tcPr>
           <w:p>
             <w:r>
               <w:rPr>
+                <w:b w:val="0"/>
+                <w:i w:val="0"/>
                 <w:color w:val="22303C"/>
                 <w:sz w:val="20"/>
               </w:rPr>
@@ -1714,11 +2508,13 @@
       <w:tr>
         <w:tc>
           <w:tcPr>
-            <w:tcW w:type="dxa" w:w="2160"/>
+            <w:tcW w:type="dxa" w:w="1210"/>
           </w:tcPr>
           <w:p>
             <w:r>
               <w:rPr>
+                <w:b w:val="0"/>
+                <w:i w:val="0"/>
                 <w:color w:val="22303C"/>
                 <w:sz w:val="20"/>
               </w:rPr>
@@ -1728,12 +2524,14 @@
         </w:tc>
         <w:tc>
           <w:tcPr>
-            <w:tcW w:type="dxa" w:w="1296"/>
+            <w:tcW w:type="dxa" w:w="990"/>
           </w:tcPr>
           <w:p>
             <w:r>
               <w:rPr>
-                <w:color w:val="22303C"/>
+                <w:b w:val="0"/>
+                <w:i w:val="0"/>
+                <w:color w:val="2E6BA0"/>
                 <w:sz w:val="20"/>
               </w:rPr>
               <w:t>#30</w:t>
@@ -1742,11 +2540,13 @@
         </w:tc>
         <w:tc>
           <w:tcPr>
-            <w:tcW w:type="dxa" w:w="6624"/>
+            <w:tcW w:type="dxa" w:w="7592"/>
           </w:tcPr>
           <w:p>
             <w:r>
               <w:rPr>
+                <w:b w:val="0"/>
+                <w:i w:val="0"/>
                 <w:color w:val="22303C"/>
                 <w:sz w:val="20"/>
               </w:rPr>
@@ -1758,11 +2558,13 @@
       <w:tr>
         <w:tc>
           <w:tcPr>
-            <w:tcW w:type="dxa" w:w="2160"/>
+            <w:tcW w:type="dxa" w:w="1210"/>
           </w:tcPr>
           <w:p>
             <w:r>
               <w:rPr>
+                <w:b w:val="0"/>
+                <w:i w:val="0"/>
                 <w:color w:val="22303C"/>
                 <w:sz w:val="20"/>
               </w:rPr>
@@ -1772,25 +2574,47 @@
         </w:tc>
         <w:tc>
           <w:tcPr>
-            <w:tcW w:type="dxa" w:w="1296"/>
+            <w:tcW w:type="dxa" w:w="990"/>
           </w:tcPr>
           <w:p>
             <w:r>
               <w:rPr>
+                <w:b w:val="0"/>
+                <w:i w:val="0"/>
+                <w:color w:val="2E6BA0"/>
+                <w:sz w:val="20"/>
+              </w:rPr>
+              <w:t>#21</w:t>
+            </w:r>
+            <w:r>
+              <w:rPr>
+                <w:b w:val="0"/>
+                <w:i w:val="0"/>
                 <w:color w:val="22303C"/>
                 <w:sz w:val="20"/>
               </w:rPr>
-              <w:t>#21 / #20</w:t>
+              <w:t xml:space="preserve"> / </w:t>
+            </w:r>
+            <w:r>
+              <w:rPr>
+                <w:b w:val="0"/>
+                <w:i w:val="0"/>
+                <w:color w:val="2E6BA0"/>
+                <w:sz w:val="20"/>
+              </w:rPr>
+              <w:t>#20</w:t>
             </w:r>
           </w:p>
         </w:tc>
         <w:tc>
           <w:tcPr>
-            <w:tcW w:type="dxa" w:w="6624"/>
+            <w:tcW w:type="dxa" w:w="7592"/>
           </w:tcPr>
           <w:p>
             <w:r>
               <w:rPr>
+                <w:b w:val="0"/>
+                <w:i w:val="0"/>
                 <w:color w:val="22303C"/>
                 <w:sz w:val="20"/>
               </w:rPr>
@@ -1802,11 +2626,13 @@
       <w:tr>
         <w:tc>
           <w:tcPr>
-            <w:tcW w:type="dxa" w:w="2160"/>
+            <w:tcW w:type="dxa" w:w="1210"/>
           </w:tcPr>
           <w:p>
             <w:r>
               <w:rPr>
+                <w:b w:val="0"/>
+                <w:i w:val="0"/>
                 <w:color w:val="22303C"/>
                 <w:sz w:val="20"/>
               </w:rPr>
@@ -1816,12 +2642,14 @@
         </w:tc>
         <w:tc>
           <w:tcPr>
-            <w:tcW w:type="dxa" w:w="1296"/>
+            <w:tcW w:type="dxa" w:w="990"/>
           </w:tcPr>
           <w:p>
             <w:r>
               <w:rPr>
-                <w:color w:val="22303C"/>
+                <w:b w:val="0"/>
+                <w:i w:val="0"/>
+                <w:color w:val="2E6BA0"/>
                 <w:sz w:val="20"/>
               </w:rPr>
               <w:t>#13</w:t>
@@ -1830,11 +2658,13 @@
         </w:tc>
         <w:tc>
           <w:tcPr>
-            <w:tcW w:type="dxa" w:w="6624"/>
+            <w:tcW w:type="dxa" w:w="7592"/>
           </w:tcPr>
           <w:p>
             <w:r>
               <w:rPr>
+                <w:b w:val="0"/>
+                <w:i w:val="0"/>
                 <w:color w:val="22303C"/>
                 <w:sz w:val="20"/>
               </w:rPr>
@@ -1854,6 +2684,12 @@
         <w:pStyle w:val="Heading2"/>
       </w:pPr>
       <w:r>
+        <w:rPr>
+          <w:b w:val="0"/>
+          <w:i w:val="0"/>
+          <w:color w:val="22303C"/>
+          <w:sz w:val="25"/>
+        </w:rPr>
         <w:t>Todo</w:t>
       </w:r>
     </w:p>
@@ -1873,13 +2709,14 @@
       <w:tr>
         <w:tc>
           <w:tcPr>
-            <w:tcW w:type="dxa" w:w="2160"/>
+            <w:tcW w:type="dxa" w:w="2052"/>
             <w:shd w:val="clear" w:fill="2E6BA0"/>
           </w:tcPr>
           <w:p>
             <w:r>
               <w:rPr>
                 <w:b/>
+                <w:i w:val="0"/>
                 <w:color w:val="FFFFFF"/>
                 <w:sz w:val="20"/>
               </w:rPr>
@@ -1889,13 +2726,14 @@
         </w:tc>
         <w:tc>
           <w:tcPr>
-            <w:tcW w:type="dxa" w:w="1296"/>
+            <w:tcW w:type="dxa" w:w="792"/>
             <w:shd w:val="clear" w:fill="2E6BA0"/>
           </w:tcPr>
           <w:p>
             <w:r>
               <w:rPr>
                 <w:b/>
+                <w:i w:val="0"/>
                 <w:color w:val="FFFFFF"/>
                 <w:sz w:val="20"/>
               </w:rPr>
@@ -1905,13 +2743,14 @@
         </w:tc>
         <w:tc>
           <w:tcPr>
-            <w:tcW w:type="dxa" w:w="6624"/>
+            <w:tcW w:type="dxa" w:w="7274"/>
             <w:shd w:val="clear" w:fill="2E6BA0"/>
           </w:tcPr>
           <w:p>
             <w:r>
               <w:rPr>
                 <w:b/>
+                <w:i w:val="0"/>
                 <w:color w:val="FFFFFF"/>
                 <w:sz w:val="20"/>
               </w:rPr>
@@ -1923,11 +2762,13 @@
       <w:tr>
         <w:tc>
           <w:tcPr>
-            <w:tcW w:type="dxa" w:w="2160"/>
+            <w:tcW w:type="dxa" w:w="2052"/>
           </w:tcPr>
           <w:p>
             <w:r>
               <w:rPr>
+                <w:b w:val="0"/>
+                <w:i w:val="0"/>
                 <w:color w:val="22303C"/>
                 <w:sz w:val="20"/>
               </w:rPr>
@@ -1937,12 +2778,14 @@
         </w:tc>
         <w:tc>
           <w:tcPr>
-            <w:tcW w:type="dxa" w:w="1296"/>
+            <w:tcW w:type="dxa" w:w="792"/>
           </w:tcPr>
           <w:p>
             <w:r>
               <w:rPr>
-                <w:color w:val="22303C"/>
+                <w:b w:val="0"/>
+                <w:i w:val="0"/>
+                <w:color w:val="2E6BA0"/>
                 <w:sz w:val="20"/>
               </w:rPr>
               <w:t>#22</w:t>
@@ -1951,11 +2794,13 @@
         </w:tc>
         <w:tc>
           <w:tcPr>
-            <w:tcW w:type="dxa" w:w="6624"/>
+            <w:tcW w:type="dxa" w:w="7274"/>
           </w:tcPr>
           <w:p>
             <w:r>
               <w:rPr>
+                <w:b w:val="0"/>
+                <w:i w:val="0"/>
                 <w:color w:val="22303C"/>
                 <w:sz w:val="20"/>
               </w:rPr>
@@ -1967,11 +2812,13 @@
       <w:tr>
         <w:tc>
           <w:tcPr>
-            <w:tcW w:type="dxa" w:w="2160"/>
+            <w:tcW w:type="dxa" w:w="2052"/>
           </w:tcPr>
           <w:p>
             <w:r>
               <w:rPr>
+                <w:b w:val="0"/>
+                <w:i w:val="0"/>
                 <w:color w:val="22303C"/>
                 <w:sz w:val="20"/>
               </w:rPr>
@@ -1981,12 +2828,14 @@
         </w:tc>
         <w:tc>
           <w:tcPr>
-            <w:tcW w:type="dxa" w:w="1296"/>
+            <w:tcW w:type="dxa" w:w="792"/>
           </w:tcPr>
           <w:p>
             <w:r>
               <w:rPr>
-                <w:color w:val="22303C"/>
+                <w:b w:val="0"/>
+                <w:i w:val="0"/>
+                <w:color w:val="2E6BA0"/>
                 <w:sz w:val="20"/>
               </w:rPr>
               <w:t>#56</w:t>
@@ -1995,11 +2844,13 @@
         </w:tc>
         <w:tc>
           <w:tcPr>
-            <w:tcW w:type="dxa" w:w="6624"/>
+            <w:tcW w:type="dxa" w:w="7274"/>
           </w:tcPr>
           <w:p>
             <w:r>
               <w:rPr>
+                <w:b w:val="0"/>
+                <w:i w:val="0"/>
                 <w:color w:val="22303C"/>
                 <w:sz w:val="20"/>
               </w:rPr>
@@ -2011,11 +2862,13 @@
       <w:tr>
         <w:tc>
           <w:tcPr>
-            <w:tcW w:type="dxa" w:w="2160"/>
+            <w:tcW w:type="dxa" w:w="2052"/>
           </w:tcPr>
           <w:p>
             <w:r>
               <w:rPr>
+                <w:b w:val="0"/>
+                <w:i w:val="0"/>
                 <w:color w:val="22303C"/>
                 <w:sz w:val="20"/>
               </w:rPr>
@@ -2025,12 +2878,14 @@
         </w:tc>
         <w:tc>
           <w:tcPr>
-            <w:tcW w:type="dxa" w:w="1296"/>
+            <w:tcW w:type="dxa" w:w="792"/>
           </w:tcPr>
           <w:p>
             <w:r>
               <w:rPr>
-                <w:color w:val="22303C"/>
+                <w:b w:val="0"/>
+                <w:i w:val="0"/>
+                <w:color w:val="2E6BA0"/>
                 <w:sz w:val="20"/>
               </w:rPr>
               <w:t>#25</w:t>
@@ -2039,11 +2894,13 @@
         </w:tc>
         <w:tc>
           <w:tcPr>
-            <w:tcW w:type="dxa" w:w="6624"/>
+            <w:tcW w:type="dxa" w:w="7274"/>
           </w:tcPr>
           <w:p>
             <w:r>
               <w:rPr>
+                <w:b w:val="0"/>
+                <w:i w:val="0"/>
                 <w:color w:val="22303C"/>
                 <w:sz w:val="20"/>
               </w:rPr>
@@ -2055,11 +2912,13 @@
       <w:tr>
         <w:tc>
           <w:tcPr>
-            <w:tcW w:type="dxa" w:w="2160"/>
+            <w:tcW w:type="dxa" w:w="2052"/>
           </w:tcPr>
           <w:p>
             <w:r>
               <w:rPr>
+                <w:b w:val="0"/>
+                <w:i w:val="0"/>
                 <w:color w:val="22303C"/>
                 <w:sz w:val="20"/>
               </w:rPr>
@@ -2069,12 +2928,14 @@
         </w:tc>
         <w:tc>
           <w:tcPr>
-            <w:tcW w:type="dxa" w:w="1296"/>
+            <w:tcW w:type="dxa" w:w="792"/>
           </w:tcPr>
           <w:p>
             <w:r>
               <w:rPr>
-                <w:color w:val="22303C"/>
+                <w:b w:val="0"/>
+                <w:i w:val="0"/>
+                <w:color w:val="2E6BA0"/>
                 <w:sz w:val="20"/>
               </w:rPr>
               <w:t>#19</w:t>
@@ -2083,15 +2944,17 @@
         </w:tc>
         <w:tc>
           <w:tcPr>
-            <w:tcW w:type="dxa" w:w="6624"/>
+            <w:tcW w:type="dxa" w:w="7274"/>
           </w:tcPr>
           <w:p>
             <w:r>
               <w:rPr>
+                <w:b w:val="0"/>
+                <w:i w:val="0"/>
                 <w:color w:val="22303C"/>
                 <w:sz w:val="20"/>
               </w:rPr>
-              <w:t>Tutorial tip above “Look Up &amp; Save” button</w:t>
+              <w:t>Tutorial tip above "Look Up &amp; Save" button</w:t>
             </w:r>
           </w:p>
         </w:tc>
@@ -2099,11 +2962,13 @@
       <w:tr>
         <w:tc>
           <w:tcPr>
-            <w:tcW w:type="dxa" w:w="2160"/>
+            <w:tcW w:type="dxa" w:w="2052"/>
           </w:tcPr>
           <w:p>
             <w:r>
               <w:rPr>
+                <w:b w:val="0"/>
+                <w:i w:val="0"/>
                 <w:color w:val="22303C"/>
                 <w:sz w:val="20"/>
               </w:rPr>
@@ -2113,12 +2978,14 @@
         </w:tc>
         <w:tc>
           <w:tcPr>
-            <w:tcW w:type="dxa" w:w="1296"/>
+            <w:tcW w:type="dxa" w:w="792"/>
           </w:tcPr>
           <w:p>
             <w:r>
               <w:rPr>
-                <w:color w:val="22303C"/>
+                <w:b w:val="0"/>
+                <w:i w:val="0"/>
+                <w:color w:val="2E6BA0"/>
                 <w:sz w:val="20"/>
               </w:rPr>
               <w:t>#15</w:t>
@@ -2127,11 +2994,13 @@
         </w:tc>
         <w:tc>
           <w:tcPr>
-            <w:tcW w:type="dxa" w:w="6624"/>
+            <w:tcW w:type="dxa" w:w="7274"/>
           </w:tcPr>
           <w:p>
             <w:r>
               <w:rPr>
+                <w:b w:val="0"/>
+                <w:i w:val="0"/>
                 <w:color w:val="22303C"/>
                 <w:sz w:val="20"/>
               </w:rPr>
@@ -2143,11 +3012,13 @@
       <w:tr>
         <w:tc>
           <w:tcPr>
-            <w:tcW w:type="dxa" w:w="2160"/>
+            <w:tcW w:type="dxa" w:w="2052"/>
           </w:tcPr>
           <w:p>
             <w:r>
               <w:rPr>
+                <w:b w:val="0"/>
+                <w:i w:val="0"/>
                 <w:color w:val="22303C"/>
                 <w:sz w:val="20"/>
               </w:rPr>
@@ -2157,12 +3028,14 @@
         </w:tc>
         <w:tc>
           <w:tcPr>
-            <w:tcW w:type="dxa" w:w="1296"/>
+            <w:tcW w:type="dxa" w:w="792"/>
           </w:tcPr>
           <w:p>
             <w:r>
               <w:rPr>
-                <w:color w:val="22303C"/>
+                <w:b w:val="0"/>
+                <w:i w:val="0"/>
+                <w:color w:val="2E6BA0"/>
                 <w:sz w:val="20"/>
               </w:rPr>
               <w:t>#66</w:t>
@@ -2171,11 +3044,13 @@
         </w:tc>
         <w:tc>
           <w:tcPr>
-            <w:tcW w:type="dxa" w:w="6624"/>
+            <w:tcW w:type="dxa" w:w="7274"/>
           </w:tcPr>
           <w:p>
             <w:r>
               <w:rPr>
+                <w:b w:val="0"/>
+                <w:i w:val="0"/>
                 <w:color w:val="22303C"/>
                 <w:sz w:val="20"/>
               </w:rPr>
@@ -2187,11 +3062,13 @@
       <w:tr>
         <w:tc>
           <w:tcPr>
-            <w:tcW w:type="dxa" w:w="2160"/>
+            <w:tcW w:type="dxa" w:w="2052"/>
           </w:tcPr>
           <w:p>
             <w:r>
               <w:rPr>
+                <w:b w:val="0"/>
+                <w:i w:val="0"/>
                 <w:color w:val="22303C"/>
                 <w:sz w:val="20"/>
               </w:rPr>
@@ -2201,12 +3078,14 @@
         </w:tc>
         <w:tc>
           <w:tcPr>
-            <w:tcW w:type="dxa" w:w="1296"/>
+            <w:tcW w:type="dxa" w:w="792"/>
           </w:tcPr>
           <w:p>
             <w:r>
               <w:rPr>
-                <w:color w:val="22303C"/>
+                <w:b w:val="0"/>
+                <w:i w:val="0"/>
+                <w:color w:val="2E6BA0"/>
                 <w:sz w:val="20"/>
               </w:rPr>
               <w:t>#19</w:t>
@@ -2215,11 +3094,13 @@
         </w:tc>
         <w:tc>
           <w:tcPr>
-            <w:tcW w:type="dxa" w:w="6624"/>
+            <w:tcW w:type="dxa" w:w="7274"/>
           </w:tcPr>
           <w:p>
             <w:r>
               <w:rPr>
+                <w:b w:val="0"/>
+                <w:i w:val="0"/>
                 <w:color w:val="22303C"/>
                 <w:sz w:val="20"/>
               </w:rPr>
@@ -2231,11 +3112,13 @@
       <w:tr>
         <w:tc>
           <w:tcPr>
-            <w:tcW w:type="dxa" w:w="2160"/>
+            <w:tcW w:type="dxa" w:w="2052"/>
           </w:tcPr>
           <w:p>
             <w:r>
               <w:rPr>
+                <w:b w:val="0"/>
+                <w:i w:val="0"/>
                 <w:color w:val="22303C"/>
                 <w:sz w:val="20"/>
               </w:rPr>
@@ -2245,12 +3128,14 @@
         </w:tc>
         <w:tc>
           <w:tcPr>
-            <w:tcW w:type="dxa" w:w="1296"/>
+            <w:tcW w:type="dxa" w:w="792"/>
           </w:tcPr>
           <w:p>
             <w:r>
               <w:rPr>
-                <w:color w:val="22303C"/>
+                <w:b w:val="0"/>
+                <w:i w:val="0"/>
+                <w:color w:val="2E6BA0"/>
                 <w:sz w:val="20"/>
               </w:rPr>
               <w:t>#47</w:t>
@@ -2259,11 +3144,13 @@
         </w:tc>
         <w:tc>
           <w:tcPr>
-            <w:tcW w:type="dxa" w:w="6624"/>
+            <w:tcW w:type="dxa" w:w="7274"/>
           </w:tcPr>
           <w:p>
             <w:r>
               <w:rPr>
+                <w:b w:val="0"/>
+                <w:i w:val="0"/>
                 <w:color w:val="22303C"/>
                 <w:sz w:val="20"/>
               </w:rPr>
@@ -2275,11 +3162,13 @@
       <w:tr>
         <w:tc>
           <w:tcPr>
-            <w:tcW w:type="dxa" w:w="2160"/>
+            <w:tcW w:type="dxa" w:w="2052"/>
           </w:tcPr>
           <w:p>
             <w:r>
               <w:rPr>
+                <w:b w:val="0"/>
+                <w:i w:val="0"/>
                 <w:color w:val="22303C"/>
                 <w:sz w:val="20"/>
               </w:rPr>
@@ -2289,12 +3178,14 @@
         </w:tc>
         <w:tc>
           <w:tcPr>
-            <w:tcW w:type="dxa" w:w="1296"/>
+            <w:tcW w:type="dxa" w:w="792"/>
           </w:tcPr>
           <w:p>
             <w:r>
               <w:rPr>
-                <w:color w:val="22303C"/>
+                <w:b w:val="0"/>
+                <w:i w:val="0"/>
+                <w:color w:val="2E6BA0"/>
                 <w:sz w:val="20"/>
               </w:rPr>
               <w:t>#28</w:t>
@@ -2303,11 +3194,13 @@
         </w:tc>
         <w:tc>
           <w:tcPr>
-            <w:tcW w:type="dxa" w:w="6624"/>
+            <w:tcW w:type="dxa" w:w="7274"/>
           </w:tcPr>
           <w:p>
             <w:r>
               <w:rPr>
+                <w:b w:val="0"/>
+                <w:i w:val="0"/>
                 <w:color w:val="22303C"/>
                 <w:sz w:val="20"/>
               </w:rPr>
@@ -2319,11 +3212,13 @@
       <w:tr>
         <w:tc>
           <w:tcPr>
-            <w:tcW w:type="dxa" w:w="2160"/>
+            <w:tcW w:type="dxa" w:w="2052"/>
           </w:tcPr>
           <w:p>
             <w:r>
               <w:rPr>
+                <w:b w:val="0"/>
+                <w:i w:val="0"/>
                 <w:color w:val="22303C"/>
                 <w:sz w:val="20"/>
               </w:rPr>
@@ -2333,12 +3228,14 @@
         </w:tc>
         <w:tc>
           <w:tcPr>
-            <w:tcW w:type="dxa" w:w="1296"/>
+            <w:tcW w:type="dxa" w:w="792"/>
           </w:tcPr>
           <w:p>
             <w:r>
               <w:rPr>
-                <w:color w:val="22303C"/>
+                <w:b w:val="0"/>
+                <w:i w:val="0"/>
+                <w:color w:val="2E6BA0"/>
                 <w:sz w:val="20"/>
               </w:rPr>
               <w:t>#4</w:t>
@@ -2347,11 +3244,13 @@
         </w:tc>
         <w:tc>
           <w:tcPr>
-            <w:tcW w:type="dxa" w:w="6624"/>
+            <w:tcW w:type="dxa" w:w="7274"/>
           </w:tcPr>
           <w:p>
             <w:r>
               <w:rPr>
+                <w:b w:val="0"/>
+                <w:i w:val="0"/>
                 <w:color w:val="22303C"/>
                 <w:sz w:val="20"/>
               </w:rPr>
@@ -2381,10 +3280,10 @@
         <w:rPr>
           <w:b w:val="0"/>
           <w:i/>
-          <w:color w:val="5B6B7A"/>
-          <w:sz w:val="18"/>
+          <w:color w:val="22303C"/>
+          <w:sz w:val="22"/>
         </w:rPr>
-        <w:t>Report generated 13 July 2026 from GitHub PR and issue data across the three repositories, covering every merged PR from the first (kuantorflow#1, 9 July 2026) to the most recent (kuantorflow#64, 13 July 2026).</w:t>
+        <w:t>Report generated 13 July 2026 from GitHub PR and issue data across the three repositories (`gh pr list` / `gh issue list`), covering every merged PR from the first (kuantorflow#1, 9 July 2026) to the most recent (kuantorflow#64, 13 July 2026).</w:t>
       </w:r>
     </w:p>
     <w:sectPr>

</xml_diff>